<commit_message>
Relaciona main.py com busca.py
</commit_message>
<xml_diff>
--- a/relatorio/Template de Documento.docx
+++ b/relatorio/Template de Documento.docx
@@ -1441,15 +1441,6 @@
     </w:p>
     <w:p>
       <w:pPr>
-        <w:ind w:left="360"/>
-        <w:rPr>
-          <w:b/>
-          <w:bCs/>
-        </w:rPr>
-      </w:pPr>
-    </w:p>
-    <w:p>
-      <w:pPr>
         <w:spacing w:line="360" w:lineRule="auto"/>
         <w:ind w:left="357" w:firstLine="709"/>
         <w:jc w:val="both"/>
@@ -1558,7 +1549,67 @@
           <w:sz w:val="24"/>
           <w:szCs w:val="24"/>
         </w:rPr>
-        <w:t xml:space="preserve"> para armazenar os estados, as paredes e as caixas. A escolha por estruturas imutáveis ocorre porque os algoritmos de busca precisam registrar os caminhos percorridos em tabelas de controle que exigem dados fixos, prevenindo alterações acidentais na memória e viabilizando a validação rápida dos nós explorados.</w:t>
+        <w:t xml:space="preserve"> para armazenar os estados, as paredes e as caixas. </w:t>
+      </w:r>
+      <w:r>
+        <w:rPr>
+          <w:rFonts w:ascii="Times New Roman" w:hAnsi="Times New Roman" w:cs="Times New Roman"/>
+          <w:sz w:val="24"/>
+          <w:szCs w:val="24"/>
+        </w:rPr>
+        <w:t xml:space="preserve">A </w:t>
+      </w:r>
+      <w:r>
+        <w:rPr>
+          <w:rFonts w:ascii="Times New Roman" w:hAnsi="Times New Roman" w:cs="Times New Roman"/>
+          <w:sz w:val="24"/>
+          <w:szCs w:val="24"/>
+        </w:rPr>
+        <w:t>escolha por estruturas imutáveis ocorre porque os algoritmos de busca utilizam dicionários e conjuntos (sets) na memória para registrar os caminhos já percorridos. Na linguagem Python, apenas dados com identidade fixa e imutável (</w:t>
+      </w:r>
+      <w:proofErr w:type="spellStart"/>
+      <w:r>
+        <w:rPr>
+          <w:rFonts w:ascii="Times New Roman" w:hAnsi="Times New Roman" w:cs="Times New Roman"/>
+          <w:i/>
+          <w:iCs/>
+          <w:sz w:val="24"/>
+          <w:szCs w:val="24"/>
+        </w:rPr>
+        <w:t>hash</w:t>
+      </w:r>
+      <w:proofErr w:type="spellEnd"/>
+      <w:r>
+        <w:rPr>
+          <w:rFonts w:ascii="Times New Roman" w:hAnsi="Times New Roman" w:cs="Times New Roman"/>
+          <w:sz w:val="24"/>
+          <w:szCs w:val="24"/>
+        </w:rPr>
+        <w:t xml:space="preserve">) são aceitos como chaves de controle nessas tabelas. Dessa forma, o uso da tupla atende a essa exigência técnica da linguagem, prevenindo alterações acidentais na configuração do </w:t>
+      </w:r>
+      <w:r>
+        <w:rPr>
+          <w:rFonts w:ascii="Times New Roman" w:hAnsi="Times New Roman" w:cs="Times New Roman"/>
+          <w:sz w:val="24"/>
+          <w:szCs w:val="24"/>
+        </w:rPr>
+        <w:t>labirinto e viabilizando a validação imediata dos nós já explorados pelo algoritmo.</w:t>
+      </w:r>
+      <w:r>
+        <w:rPr>
+          <w:rFonts w:ascii="Times New Roman" w:hAnsi="Times New Roman" w:cs="Times New Roman"/>
+          <w:sz w:val="24"/>
+          <w:szCs w:val="24"/>
+        </w:rPr>
+        <w:t xml:space="preserve"> </w:t>
+      </w:r>
+      <w:r>
+        <w:rPr>
+          <w:rFonts w:ascii="Times New Roman" w:hAnsi="Times New Roman" w:cs="Times New Roman"/>
+          <w:sz w:val="24"/>
+          <w:szCs w:val="24"/>
+        </w:rPr>
+        <w:t>No código, essa estrutura foi definida da seguinte forma:</w:t>
       </w:r>
     </w:p>
     <w:p>
@@ -1573,13 +1624,53 @@
           <w:szCs w:val="24"/>
         </w:rPr>
       </w:pPr>
-      <w:r>
-        <w:rPr>
-          <w:rFonts w:ascii="Times New Roman" w:hAnsi="Times New Roman" w:cs="Times New Roman"/>
-          <w:sz w:val="24"/>
-          <w:szCs w:val="24"/>
-        </w:rPr>
-        <w:t>As particularidades do Problema 8 exigem o tratamento de becos sem saída, situação em que uma caixa é empurrada para um canto sem alvo e fica presa de forma definitiva. Para contornar esse problema, a modelagem inclui verificações automáticas que identificam caixas trancadas em cantos ou em bloqueios estruturais, descartando esses estados inválidos antes de expandir a árvore de busca e economizando tempo de processamento.</w:t>
+    </w:p>
+    <w:p>
+      <w:pPr>
+        <w:pStyle w:val="PargrafodaLista"/>
+        <w:spacing w:line="360" w:lineRule="auto"/>
+        <w:ind w:firstLine="709"/>
+        <w:rPr>
+          <w:rFonts w:ascii="Courier New" w:hAnsi="Courier New" w:cs="Courier New"/>
+          <w:sz w:val="24"/>
+          <w:szCs w:val="24"/>
+        </w:rPr>
+      </w:pPr>
+      <w:proofErr w:type="spellStart"/>
+      <w:r>
+        <w:rPr>
+          <w:rFonts w:ascii="Courier New" w:hAnsi="Courier New" w:cs="Courier New"/>
+          <w:sz w:val="24"/>
+          <w:szCs w:val="24"/>
+        </w:rPr>
+        <w:t>estado_inicial</w:t>
+      </w:r>
+      <w:proofErr w:type="spellEnd"/>
+      <w:r>
+        <w:rPr>
+          <w:rFonts w:ascii="Courier New" w:hAnsi="Courier New" w:cs="Courier New"/>
+          <w:sz w:val="24"/>
+          <w:szCs w:val="24"/>
+        </w:rPr>
+        <w:t xml:space="preserve"> = (agente, </w:t>
+      </w:r>
+      <w:proofErr w:type="spellStart"/>
+      <w:r>
+        <w:rPr>
+          <w:rFonts w:ascii="Courier New" w:hAnsi="Courier New" w:cs="Courier New"/>
+          <w:sz w:val="24"/>
+          <w:szCs w:val="24"/>
+        </w:rPr>
+        <w:t>frozenset</w:t>
+      </w:r>
+      <w:proofErr w:type="spellEnd"/>
+      <w:r>
+        <w:rPr>
+          <w:rFonts w:ascii="Courier New" w:hAnsi="Courier New" w:cs="Courier New"/>
+          <w:sz w:val="24"/>
+          <w:szCs w:val="24"/>
+        </w:rPr>
+        <w:t>(caixas))</w:t>
       </w:r>
     </w:p>
     <w:p>
@@ -1589,11 +1680,296 @@
         <w:ind w:firstLine="709"/>
         <w:jc w:val="both"/>
         <w:rPr>
+          <w:rFonts w:ascii="Courier New" w:hAnsi="Courier New" w:cs="Courier New"/>
+          <w:sz w:val="24"/>
+          <w:szCs w:val="24"/>
+        </w:rPr>
+      </w:pPr>
+    </w:p>
+    <w:p>
+      <w:pPr>
+        <w:pStyle w:val="PargrafodaLista"/>
+        <w:spacing w:line="360" w:lineRule="auto"/>
+        <w:ind w:firstLine="709"/>
+        <w:jc w:val="both"/>
+        <w:rPr>
+          <w:rFonts w:ascii="Courier New" w:hAnsi="Courier New" w:cs="Courier New"/>
+          <w:sz w:val="24"/>
+          <w:szCs w:val="24"/>
+        </w:rPr>
+      </w:pPr>
+    </w:p>
+    <w:p>
+      <w:pPr>
+        <w:pStyle w:val="PargrafodaLista"/>
+        <w:spacing w:line="360" w:lineRule="auto"/>
+        <w:ind w:firstLine="709"/>
+        <w:jc w:val="both"/>
+        <w:rPr>
           <w:rFonts w:ascii="Times New Roman" w:hAnsi="Times New Roman" w:cs="Times New Roman"/>
           <w:sz w:val="24"/>
           <w:szCs w:val="24"/>
         </w:rPr>
       </w:pPr>
+      <w:r>
+        <w:rPr>
+          <w:rFonts w:ascii="Times New Roman" w:hAnsi="Times New Roman" w:cs="Times New Roman"/>
+          <w:sz w:val="24"/>
+          <w:szCs w:val="24"/>
+        </w:rPr>
+        <w:lastRenderedPageBreak/>
+        <w:t xml:space="preserve">As particularidades do Problema 8 exigem o tratamento de becos sem saída, situação em que uma caixa é empurrada para um canto sem alvo e fica presa de forma definitiva. Para contornar esse problema, a modelagem inclui verificações matemáticas e espaciais aplicadas a cada empurrão simulado pelo agente. </w:t>
+      </w:r>
+      <w:r>
+        <w:rPr>
+          <w:rFonts w:ascii="Times New Roman" w:hAnsi="Times New Roman" w:cs="Times New Roman"/>
+          <w:sz w:val="24"/>
+          <w:szCs w:val="24"/>
+        </w:rPr>
+        <w:t xml:space="preserve">Se as </w:t>
+      </w:r>
+      <w:r>
+        <w:rPr>
+          <w:rFonts w:ascii="Times New Roman" w:hAnsi="Times New Roman" w:cs="Times New Roman"/>
+          <w:sz w:val="24"/>
+          <w:szCs w:val="24"/>
+        </w:rPr>
+        <w:t xml:space="preserve">adjacências da caixa movimentada formar uma quina encostada em paredes perpendiculares (um bloqueio simultâneo nos eixos vertical e horizontal) ou se for empurrada contra outros obstáculos formando um bloco maciço e sem espaço de manobra de 2x2 posições, a ação é classificada como inválida. </w:t>
+      </w:r>
+    </w:p>
+    <w:p>
+      <w:pPr>
+        <w:pStyle w:val="PargrafodaLista"/>
+        <w:spacing w:line="360" w:lineRule="auto"/>
+        <w:ind w:firstLine="709"/>
+        <w:jc w:val="both"/>
+        <w:rPr>
+          <w:rFonts w:ascii="Times New Roman" w:hAnsi="Times New Roman" w:cs="Times New Roman"/>
+          <w:sz w:val="24"/>
+          <w:szCs w:val="24"/>
+        </w:rPr>
+      </w:pPr>
+    </w:p>
+    <w:p>
+      <w:pPr>
+        <w:pStyle w:val="PargrafodaLista"/>
+        <w:spacing w:line="360" w:lineRule="auto"/>
+        <w:ind w:firstLine="709"/>
+        <w:rPr>
+          <w:rFonts w:ascii="Courier New" w:hAnsi="Courier New" w:cs="Courier New"/>
+          <w:sz w:val="24"/>
+          <w:szCs w:val="24"/>
+        </w:rPr>
+      </w:pPr>
+      <w:proofErr w:type="spellStart"/>
+      <w:r>
+        <w:rPr>
+          <w:rFonts w:ascii="Courier New" w:hAnsi="Courier New" w:cs="Courier New"/>
+          <w:sz w:val="24"/>
+          <w:szCs w:val="24"/>
+        </w:rPr>
+        <w:t>I</w:t>
+      </w:r>
+      <w:r>
+        <w:rPr>
+          <w:rFonts w:ascii="Courier New" w:hAnsi="Courier New" w:cs="Courier New"/>
+          <w:sz w:val="24"/>
+          <w:szCs w:val="24"/>
+        </w:rPr>
+        <w:t>f</w:t>
+      </w:r>
+      <w:proofErr w:type="spellEnd"/>
+      <w:r>
+        <w:rPr>
+          <w:rFonts w:ascii="Courier New" w:hAnsi="Courier New" w:cs="Courier New"/>
+          <w:sz w:val="24"/>
+          <w:szCs w:val="24"/>
+        </w:rPr>
+        <w:t xml:space="preserve"> </w:t>
+      </w:r>
+      <w:r>
+        <w:rPr>
+          <w:rFonts w:ascii="Courier New" w:hAnsi="Courier New" w:cs="Courier New"/>
+          <w:sz w:val="24"/>
+          <w:szCs w:val="24"/>
+        </w:rPr>
+        <w:t>self._</w:t>
+      </w:r>
+      <w:proofErr w:type="spellStart"/>
+      <w:r>
+        <w:rPr>
+          <w:rFonts w:ascii="Courier New" w:hAnsi="Courier New" w:cs="Courier New"/>
+          <w:sz w:val="24"/>
+          <w:szCs w:val="24"/>
+        </w:rPr>
+        <w:t>caixa_canto</w:t>
+      </w:r>
+      <w:proofErr w:type="spellEnd"/>
+      <w:r>
+        <w:rPr>
+          <w:rFonts w:ascii="Courier New" w:hAnsi="Courier New" w:cs="Courier New"/>
+          <w:sz w:val="24"/>
+          <w:szCs w:val="24"/>
+        </w:rPr>
+        <w:t>(</w:t>
+      </w:r>
+      <w:proofErr w:type="spellStart"/>
+      <w:r>
+        <w:rPr>
+          <w:rFonts w:ascii="Courier New" w:hAnsi="Courier New" w:cs="Courier New"/>
+          <w:sz w:val="24"/>
+          <w:szCs w:val="24"/>
+        </w:rPr>
+        <w:t>novo_estado</w:t>
+      </w:r>
+      <w:proofErr w:type="spellEnd"/>
+      <w:r>
+        <w:rPr>
+          <w:rFonts w:ascii="Courier New" w:hAnsi="Courier New" w:cs="Courier New"/>
+          <w:sz w:val="24"/>
+          <w:szCs w:val="24"/>
+        </w:rPr>
+        <w:t xml:space="preserve">) </w:t>
+      </w:r>
+      <w:proofErr w:type="spellStart"/>
+      <w:r>
+        <w:rPr>
+          <w:rFonts w:ascii="Courier New" w:hAnsi="Courier New" w:cs="Courier New"/>
+          <w:sz w:val="24"/>
+          <w:szCs w:val="24"/>
+        </w:rPr>
+        <w:t>or</w:t>
+      </w:r>
+      <w:proofErr w:type="spellEnd"/>
+      <w:r>
+        <w:rPr>
+          <w:rFonts w:ascii="Courier New" w:hAnsi="Courier New" w:cs="Courier New"/>
+          <w:sz w:val="24"/>
+          <w:szCs w:val="24"/>
+        </w:rPr>
+        <w:t xml:space="preserve"> </w:t>
+      </w:r>
+      <w:proofErr w:type="gramStart"/>
+      <w:r>
+        <w:rPr>
+          <w:rFonts w:ascii="Courier New" w:hAnsi="Courier New" w:cs="Courier New"/>
+          <w:sz w:val="24"/>
+          <w:szCs w:val="24"/>
+        </w:rPr>
+        <w:t>self._</w:t>
+      </w:r>
+      <w:proofErr w:type="gramEnd"/>
+      <w:r>
+        <w:rPr>
+          <w:rFonts w:ascii="Courier New" w:hAnsi="Courier New" w:cs="Courier New"/>
+          <w:sz w:val="24"/>
+          <w:szCs w:val="24"/>
+        </w:rPr>
+        <w:t>bloqueio_2x2(</w:t>
+      </w:r>
+      <w:proofErr w:type="spellStart"/>
+      <w:r>
+        <w:rPr>
+          <w:rFonts w:ascii="Courier New" w:hAnsi="Courier New" w:cs="Courier New"/>
+          <w:sz w:val="24"/>
+          <w:szCs w:val="24"/>
+        </w:rPr>
+        <w:t>novo_estado</w:t>
+      </w:r>
+      <w:proofErr w:type="spellEnd"/>
+      <w:r>
+        <w:rPr>
+          <w:rFonts w:ascii="Courier New" w:hAnsi="Courier New" w:cs="Courier New"/>
+          <w:sz w:val="24"/>
+          <w:szCs w:val="24"/>
+        </w:rPr>
+        <w:t>):</w:t>
+      </w:r>
+    </w:p>
+    <w:p>
+      <w:pPr>
+        <w:pStyle w:val="PargrafodaLista"/>
+        <w:spacing w:line="360" w:lineRule="auto"/>
+        <w:ind w:firstLine="709"/>
+        <w:rPr>
+          <w:rFonts w:ascii="Courier New" w:hAnsi="Courier New" w:cs="Courier New"/>
+          <w:sz w:val="24"/>
+          <w:szCs w:val="24"/>
+        </w:rPr>
+      </w:pPr>
+      <w:proofErr w:type="spellStart"/>
+      <w:proofErr w:type="gramStart"/>
+      <w:r>
+        <w:rPr>
+          <w:rFonts w:ascii="Courier New" w:hAnsi="Courier New" w:cs="Courier New"/>
+          <w:sz w:val="24"/>
+          <w:szCs w:val="24"/>
+        </w:rPr>
+        <w:t>return</w:t>
+      </w:r>
+      <w:proofErr w:type="spellEnd"/>
+      <w:r>
+        <w:rPr>
+          <w:rFonts w:ascii="Courier New" w:hAnsi="Courier New" w:cs="Courier New"/>
+          <w:sz w:val="24"/>
+          <w:szCs w:val="24"/>
+        </w:rPr>
+        <w:t xml:space="preserve"> False</w:t>
+      </w:r>
+      <w:proofErr w:type="gramEnd"/>
+      <w:r>
+        <w:rPr>
+          <w:rFonts w:ascii="Courier New" w:hAnsi="Courier New" w:cs="Courier New"/>
+          <w:sz w:val="24"/>
+          <w:szCs w:val="24"/>
+        </w:rPr>
+        <w:t xml:space="preserve"> # O estado morto é imediatamente descartado</w:t>
+      </w:r>
+    </w:p>
+    <w:p>
+      <w:pPr>
+        <w:pStyle w:val="PargrafodaLista"/>
+        <w:spacing w:line="360" w:lineRule="auto"/>
+        <w:ind w:firstLine="709"/>
+        <w:rPr>
+          <w:rFonts w:ascii="Courier New" w:hAnsi="Courier New" w:cs="Courier New"/>
+          <w:sz w:val="24"/>
+          <w:szCs w:val="24"/>
+        </w:rPr>
+      </w:pPr>
+    </w:p>
+    <w:p>
+      <w:pPr>
+        <w:pStyle w:val="PargrafodaLista"/>
+        <w:spacing w:line="360" w:lineRule="auto"/>
+        <w:ind w:firstLine="709"/>
+        <w:jc w:val="both"/>
+        <w:rPr>
+          <w:rFonts w:ascii="Times New Roman" w:hAnsi="Times New Roman" w:cs="Times New Roman"/>
+          <w:sz w:val="24"/>
+          <w:szCs w:val="24"/>
+        </w:rPr>
+      </w:pPr>
+      <w:r>
+        <w:rPr>
+          <w:rFonts w:ascii="Times New Roman" w:hAnsi="Times New Roman" w:cs="Times New Roman"/>
+          <w:sz w:val="24"/>
+          <w:szCs w:val="24"/>
+        </w:rPr>
+        <w:t>Através dessa lógica, o algoritmo descarta sumariamente os estados mortos antes de expandir a árvore de busca, poupando a máquina de processar caminhos sem solução e economizando um tempo significativo de execução.</w:t>
+      </w:r>
+    </w:p>
+    <w:p>
+      <w:pPr>
+        <w:pStyle w:val="PargrafodaLista"/>
+        <w:spacing w:line="360" w:lineRule="auto"/>
+        <w:ind w:firstLine="709"/>
+        <w:rPr>
+          <w:rFonts w:ascii="Courier New" w:hAnsi="Courier New" w:cs="Courier New"/>
+          <w:sz w:val="24"/>
+          <w:szCs w:val="24"/>
+        </w:rPr>
+      </w:pPr>
     </w:p>
     <w:p>
       <w:pPr>
@@ -1601,7 +1977,6 @@
       </w:pPr>
       <w:bookmarkStart w:id="2" w:name="_Toc240117863"/>
       <w:r>
-        <w:lastRenderedPageBreak/>
         <w:t>HEURÍSTICA</w:t>
       </w:r>
       <w:bookmarkEnd w:id="2"/>
@@ -1622,7 +1997,135 @@
         <w:pStyle w:val="NormalWeb"/>
         <w:spacing w:before="0" w:beforeAutospacing="0" w:line="360" w:lineRule="auto"/>
         <w:ind w:left="357" w:firstLine="709"/>
-        <w:jc w:val="both"/>
+        <w:rPr>
+          <w:rFonts w:ascii="Courier New" w:hAnsi="Courier New" w:cs="Courier New"/>
+        </w:rPr>
+      </w:pPr>
+      <w:proofErr w:type="spellStart"/>
+      <w:r>
+        <w:rPr>
+          <w:rFonts w:ascii="Courier New" w:hAnsi="Courier New" w:cs="Courier New"/>
+        </w:rPr>
+        <w:t>menor_dist</w:t>
+      </w:r>
+      <w:proofErr w:type="spellEnd"/>
+      <w:r>
+        <w:rPr>
+          <w:rFonts w:ascii="Courier New" w:hAnsi="Courier New" w:cs="Courier New"/>
+        </w:rPr>
+        <w:t xml:space="preserve"> = </w:t>
+      </w:r>
+      <w:proofErr w:type="gramStart"/>
+      <w:r>
+        <w:rPr>
+          <w:rFonts w:ascii="Courier New" w:hAnsi="Courier New" w:cs="Courier New"/>
+        </w:rPr>
+        <w:t>min(</w:t>
+      </w:r>
+      <w:proofErr w:type="spellStart"/>
+      <w:r>
+        <w:rPr>
+          <w:rFonts w:ascii="Courier New" w:hAnsi="Courier New" w:cs="Courier New"/>
+        </w:rPr>
+        <w:t>abs</w:t>
+      </w:r>
+      <w:proofErr w:type="spellEnd"/>
+      <w:r>
+        <w:rPr>
+          <w:rFonts w:ascii="Courier New" w:hAnsi="Courier New" w:cs="Courier New"/>
+        </w:rPr>
+        <w:t>(</w:t>
+      </w:r>
+      <w:proofErr w:type="spellStart"/>
+      <w:proofErr w:type="gramEnd"/>
+      <w:r>
+        <w:rPr>
+          <w:rFonts w:ascii="Courier New" w:hAnsi="Courier New" w:cs="Courier New"/>
+        </w:rPr>
+        <w:t>caixa.x</w:t>
+      </w:r>
+      <w:proofErr w:type="spellEnd"/>
+      <w:r>
+        <w:rPr>
+          <w:rFonts w:ascii="Courier New" w:hAnsi="Courier New" w:cs="Courier New"/>
+        </w:rPr>
+        <w:t xml:space="preserve"> - </w:t>
+      </w:r>
+      <w:proofErr w:type="spellStart"/>
+      <w:r>
+        <w:rPr>
+          <w:rFonts w:ascii="Courier New" w:hAnsi="Courier New" w:cs="Courier New"/>
+        </w:rPr>
+        <w:t>alvo.x</w:t>
+      </w:r>
+      <w:proofErr w:type="spellEnd"/>
+      <w:r>
+        <w:rPr>
+          <w:rFonts w:ascii="Courier New" w:hAnsi="Courier New" w:cs="Courier New"/>
+        </w:rPr>
+        <w:t xml:space="preserve">) + </w:t>
+      </w:r>
+      <w:proofErr w:type="spellStart"/>
+      <w:proofErr w:type="gramStart"/>
+      <w:r>
+        <w:rPr>
+          <w:rFonts w:ascii="Courier New" w:hAnsi="Courier New" w:cs="Courier New"/>
+        </w:rPr>
+        <w:t>abs</w:t>
+      </w:r>
+      <w:proofErr w:type="spellEnd"/>
+      <w:r>
+        <w:rPr>
+          <w:rFonts w:ascii="Courier New" w:hAnsi="Courier New" w:cs="Courier New"/>
+        </w:rPr>
+        <w:t>(</w:t>
+      </w:r>
+      <w:proofErr w:type="spellStart"/>
+      <w:r>
+        <w:rPr>
+          <w:rFonts w:ascii="Courier New" w:hAnsi="Courier New" w:cs="Courier New"/>
+        </w:rPr>
+        <w:t>caixa.y</w:t>
+      </w:r>
+      <w:proofErr w:type="spellEnd"/>
+      <w:proofErr w:type="gramEnd"/>
+      <w:r>
+        <w:rPr>
+          <w:rFonts w:ascii="Courier New" w:hAnsi="Courier New" w:cs="Courier New"/>
+        </w:rPr>
+        <w:t xml:space="preserve"> - </w:t>
+      </w:r>
+      <w:proofErr w:type="spellStart"/>
+      <w:proofErr w:type="gramStart"/>
+      <w:r>
+        <w:rPr>
+          <w:rFonts w:ascii="Courier New" w:hAnsi="Courier New" w:cs="Courier New"/>
+        </w:rPr>
+        <w:t>alvo.y</w:t>
+      </w:r>
+      <w:proofErr w:type="spellEnd"/>
+      <w:proofErr w:type="gramEnd"/>
+      <w:r>
+        <w:rPr>
+          <w:rFonts w:ascii="Courier New" w:hAnsi="Courier New" w:cs="Courier New"/>
+        </w:rPr>
+        <w:t>)</w:t>
+      </w:r>
+      <w:r>
+        <w:rPr>
+          <w:rFonts w:ascii="Courier New" w:hAnsi="Courier New" w:cs="Courier New"/>
+        </w:rPr>
+        <w:t>)</w:t>
+      </w:r>
+    </w:p>
+    <w:p>
+      <w:pPr>
+        <w:pStyle w:val="NormalWeb"/>
+        <w:spacing w:before="0" w:beforeAutospacing="0" w:line="360" w:lineRule="auto"/>
+        <w:ind w:left="357" w:firstLine="709"/>
+        <w:rPr>
+          <w:rFonts w:ascii="Courier New" w:hAnsi="Courier New" w:cs="Courier New"/>
+        </w:rPr>
       </w:pPr>
       <w:r>
         <w:t xml:space="preserve">Essa abordagem surgiu a partir de um relaxamento do problema original, criando um cenário hipotético com o mínimo de restrições possíveis. Esse relaxamento assume um ambiente ideal onde as paredes do labirinto não existem, as caixas não bloqueiam a passagem umas das outras e o agente não gasta movimentos adicionais para caminhar e se reposicionar antes de realizar um empurrão. </w:t>
@@ -1636,6 +2139,7 @@
         <w:jc w:val="both"/>
       </w:pPr>
       <w:r>
+        <w:lastRenderedPageBreak/>
         <w:t xml:space="preserve">A heurística escolhida é classificada como admissível porque a estimativa de passos calculada por ela sempre será menor ou igual ao custo real exigido para resolver o mapa. Como a matemática reflete uma versão relaxada do problema original, ela calcula a estimativa de custo mais baixa possível. Na prática, ao ignorar os obstáculos físicos e os deslocamentos extras do próprio agente, o cálculo nunca vai superestimar o esforço necessário para concluir o objetivo. </w:t>
       </w:r>
     </w:p>
@@ -1709,6 +2213,43 @@
       </w:r>
       <w:bookmarkEnd w:id="4"/>
     </w:p>
+    <w:p/>
+    <w:p/>
+    <w:p/>
+    <w:p/>
+    <w:p/>
+    <w:p/>
+    <w:p/>
+    <w:p/>
+    <w:p/>
+    <w:p/>
+    <w:p/>
+    <w:p/>
+    <w:p/>
+    <w:p/>
+    <w:p/>
+    <w:p/>
+    <w:p/>
+    <w:p/>
+    <w:p/>
+    <w:p/>
+    <w:p/>
+    <w:p/>
+    <w:p/>
+    <w:p/>
+    <w:p/>
+    <w:p/>
+    <w:p/>
+    <w:p/>
+    <w:p/>
+    <w:p/>
+    <w:p/>
+    <w:p/>
+    <w:p/>
+    <w:p/>
+    <w:p/>
+    <w:p/>
+    <w:p/>
     <w:p>
       <w:pPr>
         <w:pStyle w:val="Ttulo1"/>
@@ -1719,6 +2260,67 @@
       </w:r>
       <w:bookmarkEnd w:id="5"/>
     </w:p>
+    <w:p/>
+    <w:p/>
+    <w:p/>
+    <w:p/>
+    <w:p/>
+    <w:p/>
+    <w:p/>
+    <w:p/>
+    <w:p/>
+    <w:p/>
+    <w:p/>
+    <w:p/>
+    <w:p/>
+    <w:p/>
+    <w:p/>
+    <w:p/>
+    <w:p/>
+    <w:p/>
+    <w:p/>
+    <w:p/>
+    <w:p/>
+    <w:p/>
+    <w:p/>
+    <w:p/>
+    <w:p/>
+    <w:p/>
+    <w:p/>
+    <w:p/>
+    <w:p/>
+    <w:p/>
+    <w:p/>
+    <w:p/>
+    <w:p/>
+    <w:p/>
+    <w:p/>
+    <w:p/>
+    <w:p/>
+    <w:p/>
+    <w:p/>
+    <w:p/>
+    <w:p/>
+    <w:p/>
+    <w:p/>
+    <w:p/>
+    <w:p/>
+    <w:p/>
+    <w:p/>
+    <w:p/>
+    <w:p/>
+    <w:p/>
+    <w:p/>
+    <w:p/>
+    <w:p/>
+    <w:p/>
+    <w:p/>
+    <w:p/>
+    <w:p/>
+    <w:p/>
+    <w:p/>
+    <w:p/>
+    <w:p/>
     <w:p>
       <w:pPr>
         <w:pStyle w:val="Ttulo1"/>

</xml_diff>

<commit_message>
atualiza versão requerida do python de 3.13 para 3.10 ou superior
</commit_message>
<xml_diff>
--- a/relatorio/Template de Documento.docx
+++ b/relatorio/Template de Documento.docx
@@ -485,13 +485,8 @@
         <w:t xml:space="preserve"> </w:t>
       </w:r>
       <w:r>
-        <w:t xml:space="preserve">Marcos Augusto Campagnaro </w:t>
-      </w:r>
-      <w:proofErr w:type="spellStart"/>
-      <w:r>
-        <w:t>Mucelini</w:t>
-      </w:r>
-      <w:proofErr w:type="spellEnd"/>
+        <w:t>Marcos Augusto Campagnaro Mucelini</w:t>
+      </w:r>
     </w:p>
     <w:p>
       <w:pPr>
@@ -542,6 +537,13 @@
     </w:p>
     <w:sdt>
       <w:sdtPr>
+        <w:rPr>
+          <w:rFonts w:ascii="Arial" w:eastAsia="Arial" w:hAnsi="Arial" w:cs="Arial"/>
+          <w:b w:val="0"/>
+          <w:color w:val="auto"/>
+          <w:sz w:val="22"/>
+          <w:szCs w:val="22"/>
+        </w:rPr>
         <w:id w:val="-162405194"/>
         <w:docPartObj>
           <w:docPartGallery w:val="Table of Contents"/>
@@ -550,11 +552,7 @@
       </w:sdtPr>
       <w:sdtEndPr>
         <w:rPr>
-          <w:rFonts w:ascii="Arial" w:eastAsia="Arial" w:hAnsi="Arial" w:cs="Arial"/>
-          <w:bCs/>
-          <w:color w:val="auto"/>
-          <w:sz w:val="22"/>
-          <w:szCs w:val="22"/>
+          <w:bCs/>
         </w:rPr>
       </w:sdtEndPr>
       <w:sdtContent>
@@ -1531,7 +1529,6 @@
         </w:rPr>
         <w:t xml:space="preserve">Para garantir a eficiência computacional, o código utiliza tuplas e conjuntos congelados do tipo </w:t>
       </w:r>
-      <w:proofErr w:type="spellStart"/>
       <w:r>
         <w:rPr>
           <w:rFonts w:ascii="Times New Roman" w:hAnsi="Times New Roman" w:cs="Times New Roman"/>
@@ -1542,7 +1539,6 @@
         </w:rPr>
         <w:t>frozenset</w:t>
       </w:r>
-      <w:proofErr w:type="spellEnd"/>
       <w:r>
         <w:rPr>
           <w:rFonts w:ascii="Times New Roman" w:hAnsi="Times New Roman" w:cs="Times New Roman"/>
@@ -1567,7 +1563,6 @@
         </w:rPr>
         <w:t>escolha por estruturas imutáveis ocorre porque os algoritmos de busca utilizam dicionários e conjuntos (sets) na memória para registrar os caminhos já percorridos. Na linguagem Python, apenas dados com identidade fixa e imutável (</w:t>
       </w:r>
-      <w:proofErr w:type="spellStart"/>
       <w:r>
         <w:rPr>
           <w:rFonts w:ascii="Times New Roman" w:hAnsi="Times New Roman" w:cs="Times New Roman"/>
@@ -1578,7 +1573,6 @@
         </w:rPr>
         <w:t>hash</w:t>
       </w:r>
-      <w:proofErr w:type="spellEnd"/>
       <w:r>
         <w:rPr>
           <w:rFonts w:ascii="Times New Roman" w:hAnsi="Times New Roman" w:cs="Times New Roman"/>
@@ -1636,41 +1630,13 @@
           <w:szCs w:val="24"/>
         </w:rPr>
       </w:pPr>
-      <w:proofErr w:type="spellStart"/>
       <w:r>
         <w:rPr>
           <w:rFonts w:ascii="Courier New" w:hAnsi="Courier New" w:cs="Courier New"/>
           <w:sz w:val="24"/>
           <w:szCs w:val="24"/>
         </w:rPr>
-        <w:t>estado_inicial</w:t>
-      </w:r>
-      <w:proofErr w:type="spellEnd"/>
-      <w:r>
-        <w:rPr>
-          <w:rFonts w:ascii="Courier New" w:hAnsi="Courier New" w:cs="Courier New"/>
-          <w:sz w:val="24"/>
-          <w:szCs w:val="24"/>
-        </w:rPr>
-        <w:t xml:space="preserve"> = (agente, </w:t>
-      </w:r>
-      <w:proofErr w:type="spellStart"/>
-      <w:r>
-        <w:rPr>
-          <w:rFonts w:ascii="Courier New" w:hAnsi="Courier New" w:cs="Courier New"/>
-          <w:sz w:val="24"/>
-          <w:szCs w:val="24"/>
-        </w:rPr>
-        <w:t>frozenset</w:t>
-      </w:r>
-      <w:proofErr w:type="spellEnd"/>
-      <w:r>
-        <w:rPr>
-          <w:rFonts w:ascii="Courier New" w:hAnsi="Courier New" w:cs="Courier New"/>
-          <w:sz w:val="24"/>
-          <w:szCs w:val="24"/>
-        </w:rPr>
-        <w:t>(caixas))</w:t>
+        <w:t>estado_inicial = (agente, frozenset(caixas))</w:t>
       </w:r>
     </w:p>
     <w:p>
@@ -1761,14 +1727,13 @@
           <w:szCs w:val="24"/>
         </w:rPr>
       </w:pPr>
-      <w:proofErr w:type="spellStart"/>
       <w:r>
         <w:rPr>
           <w:rFonts w:ascii="Courier New" w:hAnsi="Courier New" w:cs="Courier New"/>
           <w:sz w:val="24"/>
           <w:szCs w:val="24"/>
         </w:rPr>
-        <w:t>I</w:t>
+        <w:t>If</w:t>
       </w:r>
       <w:r>
         <w:rPr>
@@ -1776,154 +1741,35 @@
           <w:sz w:val="24"/>
           <w:szCs w:val="24"/>
         </w:rPr>
-        <w:t>f</w:t>
-      </w:r>
-      <w:proofErr w:type="spellEnd"/>
+        <w:t xml:space="preserve"> </w:t>
+      </w:r>
       <w:r>
         <w:rPr>
           <w:rFonts w:ascii="Courier New" w:hAnsi="Courier New" w:cs="Courier New"/>
           <w:sz w:val="24"/>
           <w:szCs w:val="24"/>
         </w:rPr>
-        <w:t xml:space="preserve"> </w:t>
-      </w:r>
-      <w:r>
+        <w:t>self._caixa_canto(novo_estado) or self._bloqueio_2x2(novo_estado):</w:t>
+      </w:r>
+    </w:p>
+    <w:p>
+      <w:pPr>
+        <w:pStyle w:val="PargrafodaLista"/>
+        <w:spacing w:line="360" w:lineRule="auto"/>
+        <w:ind w:firstLine="709"/>
         <w:rPr>
           <w:rFonts w:ascii="Courier New" w:hAnsi="Courier New" w:cs="Courier New"/>
           <w:sz w:val="24"/>
           <w:szCs w:val="24"/>
         </w:rPr>
-        <w:t>self._</w:t>
-      </w:r>
-      <w:proofErr w:type="spellStart"/>
+      </w:pPr>
       <w:r>
         <w:rPr>
           <w:rFonts w:ascii="Courier New" w:hAnsi="Courier New" w:cs="Courier New"/>
           <w:sz w:val="24"/>
           <w:szCs w:val="24"/>
         </w:rPr>
-        <w:t>caixa_canto</w:t>
-      </w:r>
-      <w:proofErr w:type="spellEnd"/>
-      <w:r>
-        <w:rPr>
-          <w:rFonts w:ascii="Courier New" w:hAnsi="Courier New" w:cs="Courier New"/>
-          <w:sz w:val="24"/>
-          <w:szCs w:val="24"/>
-        </w:rPr>
-        <w:t>(</w:t>
-      </w:r>
-      <w:proofErr w:type="spellStart"/>
-      <w:r>
-        <w:rPr>
-          <w:rFonts w:ascii="Courier New" w:hAnsi="Courier New" w:cs="Courier New"/>
-          <w:sz w:val="24"/>
-          <w:szCs w:val="24"/>
-        </w:rPr>
-        <w:t>novo_estado</w:t>
-      </w:r>
-      <w:proofErr w:type="spellEnd"/>
-      <w:r>
-        <w:rPr>
-          <w:rFonts w:ascii="Courier New" w:hAnsi="Courier New" w:cs="Courier New"/>
-          <w:sz w:val="24"/>
-          <w:szCs w:val="24"/>
-        </w:rPr>
-        <w:t xml:space="preserve">) </w:t>
-      </w:r>
-      <w:proofErr w:type="spellStart"/>
-      <w:r>
-        <w:rPr>
-          <w:rFonts w:ascii="Courier New" w:hAnsi="Courier New" w:cs="Courier New"/>
-          <w:sz w:val="24"/>
-          <w:szCs w:val="24"/>
-        </w:rPr>
-        <w:t>or</w:t>
-      </w:r>
-      <w:proofErr w:type="spellEnd"/>
-      <w:r>
-        <w:rPr>
-          <w:rFonts w:ascii="Courier New" w:hAnsi="Courier New" w:cs="Courier New"/>
-          <w:sz w:val="24"/>
-          <w:szCs w:val="24"/>
-        </w:rPr>
-        <w:t xml:space="preserve"> </w:t>
-      </w:r>
-      <w:proofErr w:type="gramStart"/>
-      <w:r>
-        <w:rPr>
-          <w:rFonts w:ascii="Courier New" w:hAnsi="Courier New" w:cs="Courier New"/>
-          <w:sz w:val="24"/>
-          <w:szCs w:val="24"/>
-        </w:rPr>
-        <w:t>self._</w:t>
-      </w:r>
-      <w:proofErr w:type="gramEnd"/>
-      <w:r>
-        <w:rPr>
-          <w:rFonts w:ascii="Courier New" w:hAnsi="Courier New" w:cs="Courier New"/>
-          <w:sz w:val="24"/>
-          <w:szCs w:val="24"/>
-        </w:rPr>
-        <w:t>bloqueio_2x2(</w:t>
-      </w:r>
-      <w:proofErr w:type="spellStart"/>
-      <w:r>
-        <w:rPr>
-          <w:rFonts w:ascii="Courier New" w:hAnsi="Courier New" w:cs="Courier New"/>
-          <w:sz w:val="24"/>
-          <w:szCs w:val="24"/>
-        </w:rPr>
-        <w:t>novo_estado</w:t>
-      </w:r>
-      <w:proofErr w:type="spellEnd"/>
-      <w:r>
-        <w:rPr>
-          <w:rFonts w:ascii="Courier New" w:hAnsi="Courier New" w:cs="Courier New"/>
-          <w:sz w:val="24"/>
-          <w:szCs w:val="24"/>
-        </w:rPr>
-        <w:t>):</w:t>
-      </w:r>
-    </w:p>
-    <w:p>
-      <w:pPr>
-        <w:pStyle w:val="PargrafodaLista"/>
-        <w:spacing w:line="360" w:lineRule="auto"/>
-        <w:ind w:firstLine="709"/>
-        <w:rPr>
-          <w:rFonts w:ascii="Courier New" w:hAnsi="Courier New" w:cs="Courier New"/>
-          <w:sz w:val="24"/>
-          <w:szCs w:val="24"/>
-        </w:rPr>
-      </w:pPr>
-      <w:proofErr w:type="spellStart"/>
-      <w:proofErr w:type="gramStart"/>
-      <w:r>
-        <w:rPr>
-          <w:rFonts w:ascii="Courier New" w:hAnsi="Courier New" w:cs="Courier New"/>
-          <w:sz w:val="24"/>
-          <w:szCs w:val="24"/>
-        </w:rPr>
-        <w:t>return</w:t>
-      </w:r>
-      <w:proofErr w:type="spellEnd"/>
-      <w:r>
-        <w:rPr>
-          <w:rFonts w:ascii="Courier New" w:hAnsi="Courier New" w:cs="Courier New"/>
-          <w:sz w:val="24"/>
-          <w:szCs w:val="24"/>
-        </w:rPr>
-        <w:t xml:space="preserve"> False</w:t>
-      </w:r>
-      <w:proofErr w:type="gramEnd"/>
-      <w:r>
-        <w:rPr>
-          <w:rFonts w:ascii="Courier New" w:hAnsi="Courier New" w:cs="Courier New"/>
-          <w:sz w:val="24"/>
-          <w:szCs w:val="24"/>
-        </w:rPr>
-        <w:t xml:space="preserve"> # O estado morto é imediatamente descartado</w:t>
+        <w:t>return False # O estado morto é imediatamente descartado</w:t>
       </w:r>
     </w:p>
     <w:p>
@@ -2001,115 +1847,11 @@
           <w:rFonts w:ascii="Courier New" w:hAnsi="Courier New" w:cs="Courier New"/>
         </w:rPr>
       </w:pPr>
-      <w:proofErr w:type="spellStart"/>
       <w:r>
         <w:rPr>
           <w:rFonts w:ascii="Courier New" w:hAnsi="Courier New" w:cs="Courier New"/>
         </w:rPr>
-        <w:t>menor_dist</w:t>
-      </w:r>
-      <w:proofErr w:type="spellEnd"/>
-      <w:r>
-        <w:rPr>
-          <w:rFonts w:ascii="Courier New" w:hAnsi="Courier New" w:cs="Courier New"/>
-        </w:rPr>
-        <w:t xml:space="preserve"> = </w:t>
-      </w:r>
-      <w:proofErr w:type="gramStart"/>
-      <w:r>
-        <w:rPr>
-          <w:rFonts w:ascii="Courier New" w:hAnsi="Courier New" w:cs="Courier New"/>
-        </w:rPr>
-        <w:t>min(</w:t>
-      </w:r>
-      <w:proofErr w:type="spellStart"/>
-      <w:r>
-        <w:rPr>
-          <w:rFonts w:ascii="Courier New" w:hAnsi="Courier New" w:cs="Courier New"/>
-        </w:rPr>
-        <w:t>abs</w:t>
-      </w:r>
-      <w:proofErr w:type="spellEnd"/>
-      <w:r>
-        <w:rPr>
-          <w:rFonts w:ascii="Courier New" w:hAnsi="Courier New" w:cs="Courier New"/>
-        </w:rPr>
-        <w:t>(</w:t>
-      </w:r>
-      <w:proofErr w:type="spellStart"/>
-      <w:proofErr w:type="gramEnd"/>
-      <w:r>
-        <w:rPr>
-          <w:rFonts w:ascii="Courier New" w:hAnsi="Courier New" w:cs="Courier New"/>
-        </w:rPr>
-        <w:t>caixa.x</w:t>
-      </w:r>
-      <w:proofErr w:type="spellEnd"/>
-      <w:r>
-        <w:rPr>
-          <w:rFonts w:ascii="Courier New" w:hAnsi="Courier New" w:cs="Courier New"/>
-        </w:rPr>
-        <w:t xml:space="preserve"> - </w:t>
-      </w:r>
-      <w:proofErr w:type="spellStart"/>
-      <w:r>
-        <w:rPr>
-          <w:rFonts w:ascii="Courier New" w:hAnsi="Courier New" w:cs="Courier New"/>
-        </w:rPr>
-        <w:t>alvo.x</w:t>
-      </w:r>
-      <w:proofErr w:type="spellEnd"/>
-      <w:r>
-        <w:rPr>
-          <w:rFonts w:ascii="Courier New" w:hAnsi="Courier New" w:cs="Courier New"/>
-        </w:rPr>
-        <w:t xml:space="preserve">) + </w:t>
-      </w:r>
-      <w:proofErr w:type="spellStart"/>
-      <w:proofErr w:type="gramStart"/>
-      <w:r>
-        <w:rPr>
-          <w:rFonts w:ascii="Courier New" w:hAnsi="Courier New" w:cs="Courier New"/>
-        </w:rPr>
-        <w:t>abs</w:t>
-      </w:r>
-      <w:proofErr w:type="spellEnd"/>
-      <w:r>
-        <w:rPr>
-          <w:rFonts w:ascii="Courier New" w:hAnsi="Courier New" w:cs="Courier New"/>
-        </w:rPr>
-        <w:t>(</w:t>
-      </w:r>
-      <w:proofErr w:type="spellStart"/>
-      <w:r>
-        <w:rPr>
-          <w:rFonts w:ascii="Courier New" w:hAnsi="Courier New" w:cs="Courier New"/>
-        </w:rPr>
-        <w:t>caixa.y</w:t>
-      </w:r>
-      <w:proofErr w:type="spellEnd"/>
-      <w:proofErr w:type="gramEnd"/>
-      <w:r>
-        <w:rPr>
-          <w:rFonts w:ascii="Courier New" w:hAnsi="Courier New" w:cs="Courier New"/>
-        </w:rPr>
-        <w:t xml:space="preserve"> - </w:t>
-      </w:r>
-      <w:proofErr w:type="spellStart"/>
-      <w:proofErr w:type="gramStart"/>
-      <w:r>
-        <w:rPr>
-          <w:rFonts w:ascii="Courier New" w:hAnsi="Courier New" w:cs="Courier New"/>
-        </w:rPr>
-        <w:t>alvo.y</w:t>
-      </w:r>
-      <w:proofErr w:type="spellEnd"/>
-      <w:proofErr w:type="gramEnd"/>
-      <w:r>
-        <w:rPr>
-          <w:rFonts w:ascii="Courier New" w:hAnsi="Courier New" w:cs="Courier New"/>
-        </w:rPr>
-        <w:t>)</w:t>
+        <w:t>menor_dist = min(abs(caixa.x - alvo.x) + abs(caixa.y - alvo.y)</w:t>
       </w:r>
       <w:r>
         <w:rPr>
@@ -2151,18 +1893,1902 @@
       <w:r>
         <w:t>RESULTADOS</w:t>
       </w:r>
+      <w:bookmarkStart w:id="4" w:name="_Toc240117865"/>
       <w:bookmarkEnd w:id="3"/>
     </w:p>
-    <w:p>
-      <w:pPr>
-        <w:spacing w:line="360" w:lineRule="auto"/>
-        <w:ind w:left="360"/>
+    <w:p/>
+    <w:p>
+      <w:pPr>
+        <w:rPr>
+          <w:rFonts w:ascii="Times New Roman" w:hAnsi="Times New Roman" w:cs="Times New Roman"/>
+          <w:b/>
+          <w:bCs/>
+          <w:sz w:val="24"/>
+          <w:szCs w:val="24"/>
+        </w:rPr>
+      </w:pPr>
+      <w:r>
+        <w:rPr>
+          <w:rFonts w:ascii="Times New Roman" w:hAnsi="Times New Roman" w:cs="Times New Roman"/>
+          <w:b/>
+          <w:bCs/>
+          <w:sz w:val="24"/>
+          <w:szCs w:val="24"/>
+        </w:rPr>
+        <w:t xml:space="preserve">Tabela </w:t>
+      </w:r>
+      <w:r>
+        <w:rPr>
+          <w:rFonts w:ascii="Times New Roman" w:hAnsi="Times New Roman" w:cs="Times New Roman"/>
+          <w:b/>
+          <w:bCs/>
+          <w:sz w:val="24"/>
+          <w:szCs w:val="24"/>
+        </w:rPr>
+        <w:t>1</w:t>
+      </w:r>
+      <w:r>
+        <w:rPr>
+          <w:rFonts w:ascii="Times New Roman" w:hAnsi="Times New Roman" w:cs="Times New Roman"/>
+          <w:b/>
+          <w:bCs/>
+          <w:sz w:val="24"/>
+          <w:szCs w:val="24"/>
+        </w:rPr>
+        <w:t xml:space="preserve">: Resultados para o Mapa </w:t>
+      </w:r>
+      <w:r>
+        <w:rPr>
+          <w:rFonts w:ascii="Times New Roman" w:hAnsi="Times New Roman" w:cs="Times New Roman"/>
+          <w:b/>
+          <w:bCs/>
+          <w:sz w:val="24"/>
+          <w:szCs w:val="24"/>
+        </w:rPr>
+        <w:t>1</w:t>
+      </w:r>
+      <w:r>
+        <w:rPr>
+          <w:rFonts w:ascii="Times New Roman" w:hAnsi="Times New Roman" w:cs="Times New Roman"/>
+          <w:b/>
+          <w:bCs/>
+          <w:sz w:val="24"/>
+          <w:szCs w:val="24"/>
+        </w:rPr>
+        <w:t xml:space="preserve"> (</w:t>
+      </w:r>
+      <w:r>
+        <w:rPr>
+          <w:rFonts w:ascii="Times New Roman" w:hAnsi="Times New Roman" w:cs="Times New Roman"/>
+          <w:b/>
+          <w:bCs/>
+          <w:sz w:val="24"/>
+          <w:szCs w:val="24"/>
+        </w:rPr>
+        <w:t>1</w:t>
+      </w:r>
+      <w:r>
+        <w:rPr>
+          <w:rFonts w:ascii="Times New Roman" w:hAnsi="Times New Roman" w:cs="Times New Roman"/>
+          <w:b/>
+          <w:bCs/>
+          <w:sz w:val="24"/>
+          <w:szCs w:val="24"/>
+        </w:rPr>
+        <w:t xml:space="preserve"> Caixas)</w:t>
+      </w:r>
+    </w:p>
+    <w:p/>
+    <w:tbl>
+      <w:tblPr>
+        <w:tblStyle w:val="SimplesTabela3"/>
+        <w:tblW w:w="0" w:type="auto"/>
+        <w:tblLook w:val="04A0" w:firstRow="1" w:lastRow="0" w:firstColumn="1" w:lastColumn="0" w:noHBand="0" w:noVBand="1"/>
+      </w:tblPr>
+      <w:tblGrid>
+        <w:gridCol w:w="1634"/>
+        <w:gridCol w:w="1610"/>
+        <w:gridCol w:w="974"/>
+        <w:gridCol w:w="1048"/>
+        <w:gridCol w:w="2178"/>
+        <w:gridCol w:w="1555"/>
+      </w:tblGrid>
+      <w:tr>
+        <w:trPr>
+          <w:cnfStyle w:val="100000000000" w:firstRow="1" w:lastRow="0" w:firstColumn="0" w:lastColumn="0" w:oddVBand="0" w:evenVBand="0" w:oddHBand="0" w:evenHBand="0" w:firstRowFirstColumn="0" w:firstRowLastColumn="0" w:lastRowFirstColumn="0" w:lastRowLastColumn="0"/>
+        </w:trPr>
+        <w:tc>
+          <w:tcPr>
+            <w:cnfStyle w:val="001000000100" w:firstRow="0" w:lastRow="0" w:firstColumn="1" w:lastColumn="0" w:oddVBand="0" w:evenVBand="0" w:oddHBand="0" w:evenHBand="0" w:firstRowFirstColumn="1" w:firstRowLastColumn="0" w:lastRowFirstColumn="0" w:lastRowLastColumn="0"/>
+            <w:tcW w:w="0" w:type="auto"/>
+            <w:hideMark/>
+          </w:tcPr>
+          <w:p>
+            <w:pPr>
+              <w:spacing w:line="276" w:lineRule="auto"/>
+              <w:rPr>
+                <w:rFonts w:ascii="Times New Roman" w:hAnsi="Times New Roman" w:cs="Times New Roman"/>
+              </w:rPr>
+            </w:pPr>
+            <w:r>
+              <w:rPr>
+                <w:rFonts w:ascii="Times New Roman" w:hAnsi="Times New Roman" w:cs="Times New Roman"/>
+              </w:rPr>
+              <w:t>Algoritmo</w:t>
+            </w:r>
+          </w:p>
+        </w:tc>
+        <w:tc>
+          <w:tcPr>
+            <w:tcW w:w="0" w:type="auto"/>
+            <w:hideMark/>
+          </w:tcPr>
+          <w:p>
+            <w:pPr>
+              <w:spacing w:line="276" w:lineRule="auto"/>
+              <w:cnfStyle w:val="100000000000" w:firstRow="1" w:lastRow="0" w:firstColumn="0" w:lastColumn="0" w:oddVBand="0" w:evenVBand="0" w:oddHBand="0" w:evenHBand="0" w:firstRowFirstColumn="0" w:firstRowLastColumn="0" w:lastRowFirstColumn="0" w:lastRowLastColumn="0"/>
+              <w:rPr>
+                <w:rFonts w:ascii="Times New Roman" w:hAnsi="Times New Roman" w:cs="Times New Roman"/>
+              </w:rPr>
+            </w:pPr>
+            <w:r>
+              <w:rPr>
+                <w:rFonts w:ascii="Times New Roman" w:hAnsi="Times New Roman" w:cs="Times New Roman"/>
+              </w:rPr>
+              <w:t>Heurística</w:t>
+            </w:r>
+          </w:p>
+        </w:tc>
+        <w:tc>
+          <w:tcPr>
+            <w:tcW w:w="0" w:type="auto"/>
+            <w:hideMark/>
+          </w:tcPr>
+          <w:p>
+            <w:pPr>
+              <w:spacing w:line="276" w:lineRule="auto"/>
+              <w:cnfStyle w:val="100000000000" w:firstRow="1" w:lastRow="0" w:firstColumn="0" w:lastColumn="0" w:oddVBand="0" w:evenVBand="0" w:oddHBand="0" w:evenHBand="0" w:firstRowFirstColumn="0" w:firstRowLastColumn="0" w:lastRowFirstColumn="0" w:lastRowLastColumn="0"/>
+              <w:rPr>
+                <w:rFonts w:ascii="Times New Roman" w:hAnsi="Times New Roman" w:cs="Times New Roman"/>
+              </w:rPr>
+            </w:pPr>
+            <w:r>
+              <w:rPr>
+                <w:rFonts w:ascii="Times New Roman" w:hAnsi="Times New Roman" w:cs="Times New Roman"/>
+              </w:rPr>
+              <w:t>Custo</w:t>
+            </w:r>
+          </w:p>
+        </w:tc>
+        <w:tc>
+          <w:tcPr>
+            <w:tcW w:w="0" w:type="auto"/>
+            <w:hideMark/>
+          </w:tcPr>
+          <w:p>
+            <w:pPr>
+              <w:spacing w:line="276" w:lineRule="auto"/>
+              <w:cnfStyle w:val="100000000000" w:firstRow="1" w:lastRow="0" w:firstColumn="0" w:lastColumn="0" w:oddVBand="0" w:evenVBand="0" w:oddHBand="0" w:evenHBand="0" w:firstRowFirstColumn="0" w:firstRowLastColumn="0" w:lastRowFirstColumn="0" w:lastRowLastColumn="0"/>
+              <w:rPr>
+                <w:rFonts w:ascii="Times New Roman" w:hAnsi="Times New Roman" w:cs="Times New Roman"/>
+              </w:rPr>
+            </w:pPr>
+            <w:r>
+              <w:rPr>
+                <w:rFonts w:ascii="Times New Roman" w:hAnsi="Times New Roman" w:cs="Times New Roman"/>
+              </w:rPr>
+              <w:t>Passos</w:t>
+            </w:r>
+          </w:p>
+        </w:tc>
+        <w:tc>
+          <w:tcPr>
+            <w:tcW w:w="0" w:type="auto"/>
+            <w:hideMark/>
+          </w:tcPr>
+          <w:p>
+            <w:pPr>
+              <w:spacing w:line="276" w:lineRule="auto"/>
+              <w:cnfStyle w:val="100000000000" w:firstRow="1" w:lastRow="0" w:firstColumn="0" w:lastColumn="0" w:oddVBand="0" w:evenVBand="0" w:oddHBand="0" w:evenHBand="0" w:firstRowFirstColumn="0" w:firstRowLastColumn="0" w:lastRowFirstColumn="0" w:lastRowLastColumn="0"/>
+              <w:rPr>
+                <w:rFonts w:ascii="Times New Roman" w:hAnsi="Times New Roman" w:cs="Times New Roman"/>
+              </w:rPr>
+            </w:pPr>
+            <w:r>
+              <w:rPr>
+                <w:rFonts w:ascii="Times New Roman" w:hAnsi="Times New Roman" w:cs="Times New Roman"/>
+              </w:rPr>
+              <w:t>Nós expandidos</w:t>
+            </w:r>
+          </w:p>
+        </w:tc>
+        <w:tc>
+          <w:tcPr>
+            <w:tcW w:w="0" w:type="auto"/>
+            <w:hideMark/>
+          </w:tcPr>
+          <w:p>
+            <w:pPr>
+              <w:spacing w:line="276" w:lineRule="auto"/>
+              <w:cnfStyle w:val="100000000000" w:firstRow="1" w:lastRow="0" w:firstColumn="0" w:lastColumn="0" w:oddVBand="0" w:evenVBand="0" w:oddHBand="0" w:evenHBand="0" w:firstRowFirstColumn="0" w:firstRowLastColumn="0" w:lastRowFirstColumn="0" w:lastRowLastColumn="0"/>
+              <w:rPr>
+                <w:rFonts w:ascii="Times New Roman" w:hAnsi="Times New Roman" w:cs="Times New Roman"/>
+              </w:rPr>
+            </w:pPr>
+            <w:r>
+              <w:rPr>
+                <w:rFonts w:ascii="Times New Roman" w:hAnsi="Times New Roman" w:cs="Times New Roman"/>
+              </w:rPr>
+              <w:t>Tempo (ms)</w:t>
+            </w:r>
+          </w:p>
+        </w:tc>
+      </w:tr>
+      <w:tr>
+        <w:trPr>
+          <w:cnfStyle w:val="000000100000" w:firstRow="0" w:lastRow="0" w:firstColumn="0" w:lastColumn="0" w:oddVBand="0" w:evenVBand="0" w:oddHBand="1" w:evenHBand="0" w:firstRowFirstColumn="0" w:firstRowLastColumn="0" w:lastRowFirstColumn="0" w:lastRowLastColumn="0"/>
+        </w:trPr>
+        <w:tc>
+          <w:tcPr>
+            <w:cnfStyle w:val="001000000000" w:firstRow="0" w:lastRow="0" w:firstColumn="1" w:lastColumn="0" w:oddVBand="0" w:evenVBand="0" w:oddHBand="0" w:evenHBand="0" w:firstRowFirstColumn="0" w:firstRowLastColumn="0" w:lastRowFirstColumn="0" w:lastRowLastColumn="0"/>
+            <w:tcW w:w="0" w:type="auto"/>
+            <w:hideMark/>
+          </w:tcPr>
+          <w:p>
+            <w:pPr>
+              <w:spacing w:line="276" w:lineRule="auto"/>
+              <w:rPr>
+                <w:rFonts w:ascii="Times New Roman" w:hAnsi="Times New Roman" w:cs="Times New Roman"/>
+              </w:rPr>
+            </w:pPr>
+            <w:r>
+              <w:rPr>
+                <w:rFonts w:ascii="Times New Roman" w:hAnsi="Times New Roman" w:cs="Times New Roman"/>
+              </w:rPr>
+              <w:t>UCS</w:t>
+            </w:r>
+          </w:p>
+        </w:tc>
+        <w:tc>
+          <w:tcPr>
+            <w:tcW w:w="0" w:type="auto"/>
+            <w:hideMark/>
+          </w:tcPr>
+          <w:p>
+            <w:pPr>
+              <w:spacing w:line="276" w:lineRule="auto"/>
+              <w:jc w:val="center"/>
+              <w:cnfStyle w:val="000000100000" w:firstRow="0" w:lastRow="0" w:firstColumn="0" w:lastColumn="0" w:oddVBand="0" w:evenVBand="0" w:oddHBand="1" w:evenHBand="0" w:firstRowFirstColumn="0" w:firstRowLastColumn="0" w:lastRowFirstColumn="0" w:lastRowLastColumn="0"/>
+              <w:rPr>
+                <w:rFonts w:ascii="Times New Roman" w:hAnsi="Times New Roman" w:cs="Times New Roman"/>
+              </w:rPr>
+            </w:pPr>
+            <w:r>
+              <w:rPr>
+                <w:rFonts w:ascii="Times New Roman" w:hAnsi="Times New Roman" w:cs="Times New Roman"/>
+              </w:rPr>
+              <w:t>Não usa</w:t>
+            </w:r>
+          </w:p>
+        </w:tc>
+        <w:tc>
+          <w:tcPr>
+            <w:tcW w:w="0" w:type="auto"/>
+            <w:hideMark/>
+          </w:tcPr>
+          <w:p>
+            <w:pPr>
+              <w:spacing w:line="276" w:lineRule="auto"/>
+              <w:jc w:val="center"/>
+              <w:cnfStyle w:val="000000100000" w:firstRow="0" w:lastRow="0" w:firstColumn="0" w:lastColumn="0" w:oddVBand="0" w:evenVBand="0" w:oddHBand="1" w:evenHBand="0" w:firstRowFirstColumn="0" w:firstRowLastColumn="0" w:lastRowFirstColumn="0" w:lastRowLastColumn="0"/>
+              <w:rPr>
+                <w:rFonts w:ascii="Times New Roman" w:hAnsi="Times New Roman" w:cs="Times New Roman"/>
+              </w:rPr>
+            </w:pPr>
+            <w:r>
+              <w:rPr>
+                <w:rFonts w:ascii="Times New Roman" w:hAnsi="Times New Roman" w:cs="Times New Roman"/>
+              </w:rPr>
+              <w:t>9</w:t>
+            </w:r>
+          </w:p>
+        </w:tc>
+        <w:tc>
+          <w:tcPr>
+            <w:tcW w:w="0" w:type="auto"/>
+            <w:hideMark/>
+          </w:tcPr>
+          <w:p>
+            <w:pPr>
+              <w:spacing w:line="276" w:lineRule="auto"/>
+              <w:jc w:val="center"/>
+              <w:cnfStyle w:val="000000100000" w:firstRow="0" w:lastRow="0" w:firstColumn="0" w:lastColumn="0" w:oddVBand="0" w:evenVBand="0" w:oddHBand="1" w:evenHBand="0" w:firstRowFirstColumn="0" w:firstRowLastColumn="0" w:lastRowFirstColumn="0" w:lastRowLastColumn="0"/>
+              <w:rPr>
+                <w:rFonts w:ascii="Times New Roman" w:hAnsi="Times New Roman" w:cs="Times New Roman"/>
+              </w:rPr>
+            </w:pPr>
+            <w:r>
+              <w:rPr>
+                <w:rFonts w:ascii="Times New Roman" w:hAnsi="Times New Roman" w:cs="Times New Roman"/>
+              </w:rPr>
+              <w:t>9</w:t>
+            </w:r>
+          </w:p>
+        </w:tc>
+        <w:tc>
+          <w:tcPr>
+            <w:tcW w:w="0" w:type="auto"/>
+            <w:hideMark/>
+          </w:tcPr>
+          <w:p>
+            <w:pPr>
+              <w:spacing w:line="276" w:lineRule="auto"/>
+              <w:jc w:val="center"/>
+              <w:cnfStyle w:val="000000100000" w:firstRow="0" w:lastRow="0" w:firstColumn="0" w:lastColumn="0" w:oddVBand="0" w:evenVBand="0" w:oddHBand="1" w:evenHBand="0" w:firstRowFirstColumn="0" w:firstRowLastColumn="0" w:lastRowFirstColumn="0" w:lastRowLastColumn="0"/>
+              <w:rPr>
+                <w:rFonts w:ascii="Times New Roman" w:hAnsi="Times New Roman" w:cs="Times New Roman"/>
+              </w:rPr>
+            </w:pPr>
+            <w:r>
+              <w:rPr>
+                <w:rFonts w:ascii="Times New Roman" w:hAnsi="Times New Roman" w:cs="Times New Roman"/>
+              </w:rPr>
+              <w:t>158</w:t>
+            </w:r>
+          </w:p>
+        </w:tc>
+        <w:tc>
+          <w:tcPr>
+            <w:tcW w:w="0" w:type="auto"/>
+            <w:hideMark/>
+          </w:tcPr>
+          <w:p>
+            <w:pPr>
+              <w:spacing w:line="276" w:lineRule="auto"/>
+              <w:jc w:val="center"/>
+              <w:cnfStyle w:val="000000100000" w:firstRow="0" w:lastRow="0" w:firstColumn="0" w:lastColumn="0" w:oddVBand="0" w:evenVBand="0" w:oddHBand="1" w:evenHBand="0" w:firstRowFirstColumn="0" w:firstRowLastColumn="0" w:lastRowFirstColumn="0" w:lastRowLastColumn="0"/>
+              <w:rPr>
+                <w:rFonts w:ascii="Times New Roman" w:hAnsi="Times New Roman" w:cs="Times New Roman"/>
+              </w:rPr>
+            </w:pPr>
+            <w:r>
+              <w:rPr>
+                <w:rFonts w:ascii="Times New Roman" w:hAnsi="Times New Roman" w:cs="Times New Roman"/>
+              </w:rPr>
+              <w:t>1.57</w:t>
+            </w:r>
+          </w:p>
+        </w:tc>
+      </w:tr>
+      <w:tr>
+        <w:tc>
+          <w:tcPr>
+            <w:cnfStyle w:val="001000000000" w:firstRow="0" w:lastRow="0" w:firstColumn="1" w:lastColumn="0" w:oddVBand="0" w:evenVBand="0" w:oddHBand="0" w:evenHBand="0" w:firstRowFirstColumn="0" w:firstRowLastColumn="0" w:lastRowFirstColumn="0" w:lastRowLastColumn="0"/>
+            <w:tcW w:w="0" w:type="auto"/>
+            <w:hideMark/>
+          </w:tcPr>
+          <w:p>
+            <w:pPr>
+              <w:spacing w:line="276" w:lineRule="auto"/>
+              <w:rPr>
+                <w:rFonts w:ascii="Times New Roman" w:hAnsi="Times New Roman" w:cs="Times New Roman"/>
+              </w:rPr>
+            </w:pPr>
+            <w:r>
+              <w:rPr>
+                <w:rFonts w:ascii="Times New Roman" w:hAnsi="Times New Roman" w:cs="Times New Roman"/>
+              </w:rPr>
+              <w:t>Gulosa</w:t>
+            </w:r>
+          </w:p>
+        </w:tc>
+        <w:tc>
+          <w:tcPr>
+            <w:tcW w:w="0" w:type="auto"/>
+            <w:hideMark/>
+          </w:tcPr>
+          <w:p>
+            <w:pPr>
+              <w:spacing w:line="276" w:lineRule="auto"/>
+              <w:jc w:val="center"/>
+              <w:cnfStyle w:val="000000000000" w:firstRow="0" w:lastRow="0" w:firstColumn="0" w:lastColumn="0" w:oddVBand="0" w:evenVBand="0" w:oddHBand="0" w:evenHBand="0" w:firstRowFirstColumn="0" w:firstRowLastColumn="0" w:lastRowFirstColumn="0" w:lastRowLastColumn="0"/>
+              <w:rPr>
+                <w:rFonts w:ascii="Times New Roman" w:hAnsi="Times New Roman" w:cs="Times New Roman"/>
+              </w:rPr>
+            </w:pPr>
+            <w:r>
+              <w:rPr>
+                <w:rFonts w:ascii="Times New Roman" w:hAnsi="Times New Roman" w:cs="Times New Roman"/>
+              </w:rPr>
+              <w:t>Manhattan</w:t>
+            </w:r>
+          </w:p>
+        </w:tc>
+        <w:tc>
+          <w:tcPr>
+            <w:tcW w:w="0" w:type="auto"/>
+            <w:hideMark/>
+          </w:tcPr>
+          <w:p>
+            <w:pPr>
+              <w:spacing w:line="276" w:lineRule="auto"/>
+              <w:jc w:val="center"/>
+              <w:cnfStyle w:val="000000000000" w:firstRow="0" w:lastRow="0" w:firstColumn="0" w:lastColumn="0" w:oddVBand="0" w:evenVBand="0" w:oddHBand="0" w:evenHBand="0" w:firstRowFirstColumn="0" w:firstRowLastColumn="0" w:lastRowFirstColumn="0" w:lastRowLastColumn="0"/>
+              <w:rPr>
+                <w:rFonts w:ascii="Times New Roman" w:hAnsi="Times New Roman" w:cs="Times New Roman"/>
+              </w:rPr>
+            </w:pPr>
+            <w:r>
+              <w:rPr>
+                <w:rFonts w:ascii="Times New Roman" w:hAnsi="Times New Roman" w:cs="Times New Roman"/>
+              </w:rPr>
+              <w:t>9</w:t>
+            </w:r>
+          </w:p>
+        </w:tc>
+        <w:tc>
+          <w:tcPr>
+            <w:tcW w:w="0" w:type="auto"/>
+            <w:hideMark/>
+          </w:tcPr>
+          <w:p>
+            <w:pPr>
+              <w:spacing w:line="276" w:lineRule="auto"/>
+              <w:jc w:val="center"/>
+              <w:cnfStyle w:val="000000000000" w:firstRow="0" w:lastRow="0" w:firstColumn="0" w:lastColumn="0" w:oddVBand="0" w:evenVBand="0" w:oddHBand="0" w:evenHBand="0" w:firstRowFirstColumn="0" w:firstRowLastColumn="0" w:lastRowFirstColumn="0" w:lastRowLastColumn="0"/>
+              <w:rPr>
+                <w:rFonts w:ascii="Times New Roman" w:hAnsi="Times New Roman" w:cs="Times New Roman"/>
+              </w:rPr>
+            </w:pPr>
+            <w:r>
+              <w:rPr>
+                <w:rFonts w:ascii="Times New Roman" w:hAnsi="Times New Roman" w:cs="Times New Roman"/>
+              </w:rPr>
+              <w:t>9</w:t>
+            </w:r>
+          </w:p>
+        </w:tc>
+        <w:tc>
+          <w:tcPr>
+            <w:tcW w:w="0" w:type="auto"/>
+            <w:hideMark/>
+          </w:tcPr>
+          <w:p>
+            <w:pPr>
+              <w:spacing w:line="276" w:lineRule="auto"/>
+              <w:jc w:val="center"/>
+              <w:cnfStyle w:val="000000000000" w:firstRow="0" w:lastRow="0" w:firstColumn="0" w:lastColumn="0" w:oddVBand="0" w:evenVBand="0" w:oddHBand="0" w:evenHBand="0" w:firstRowFirstColumn="0" w:firstRowLastColumn="0" w:lastRowFirstColumn="0" w:lastRowLastColumn="0"/>
+              <w:rPr>
+                <w:rFonts w:ascii="Times New Roman" w:hAnsi="Times New Roman" w:cs="Times New Roman"/>
+              </w:rPr>
+            </w:pPr>
+            <w:r>
+              <w:rPr>
+                <w:rFonts w:ascii="Times New Roman" w:hAnsi="Times New Roman" w:cs="Times New Roman"/>
+              </w:rPr>
+              <w:t>17</w:t>
+            </w:r>
+          </w:p>
+        </w:tc>
+        <w:tc>
+          <w:tcPr>
+            <w:tcW w:w="0" w:type="auto"/>
+            <w:hideMark/>
+          </w:tcPr>
+          <w:p>
+            <w:pPr>
+              <w:spacing w:line="276" w:lineRule="auto"/>
+              <w:jc w:val="center"/>
+              <w:cnfStyle w:val="000000000000" w:firstRow="0" w:lastRow="0" w:firstColumn="0" w:lastColumn="0" w:oddVBand="0" w:evenVBand="0" w:oddHBand="0" w:evenHBand="0" w:firstRowFirstColumn="0" w:firstRowLastColumn="0" w:lastRowFirstColumn="0" w:lastRowLastColumn="0"/>
+              <w:rPr>
+                <w:rFonts w:ascii="Times New Roman" w:hAnsi="Times New Roman" w:cs="Times New Roman"/>
+              </w:rPr>
+            </w:pPr>
+            <w:r>
+              <w:rPr>
+                <w:rFonts w:ascii="Times New Roman" w:hAnsi="Times New Roman" w:cs="Times New Roman"/>
+              </w:rPr>
+              <w:t>0.80</w:t>
+            </w:r>
+          </w:p>
+        </w:tc>
+      </w:tr>
+      <w:tr>
+        <w:trPr>
+          <w:cnfStyle w:val="000000100000" w:firstRow="0" w:lastRow="0" w:firstColumn="0" w:lastColumn="0" w:oddVBand="0" w:evenVBand="0" w:oddHBand="1" w:evenHBand="0" w:firstRowFirstColumn="0" w:firstRowLastColumn="0" w:lastRowFirstColumn="0" w:lastRowLastColumn="0"/>
+        </w:trPr>
+        <w:tc>
+          <w:tcPr>
+            <w:cnfStyle w:val="001000000000" w:firstRow="0" w:lastRow="0" w:firstColumn="1" w:lastColumn="0" w:oddVBand="0" w:evenVBand="0" w:oddHBand="0" w:evenHBand="0" w:firstRowFirstColumn="0" w:firstRowLastColumn="0" w:lastRowFirstColumn="0" w:lastRowLastColumn="0"/>
+            <w:tcW w:w="0" w:type="auto"/>
+            <w:hideMark/>
+          </w:tcPr>
+          <w:p>
+            <w:pPr>
+              <w:spacing w:line="276" w:lineRule="auto"/>
+              <w:rPr>
+                <w:rFonts w:ascii="Times New Roman" w:hAnsi="Times New Roman" w:cs="Times New Roman"/>
+              </w:rPr>
+            </w:pPr>
+            <w:r>
+              <w:rPr>
+                <w:rFonts w:ascii="Times New Roman" w:hAnsi="Times New Roman" w:cs="Times New Roman"/>
+              </w:rPr>
+              <w:t>A*</w:t>
+            </w:r>
+          </w:p>
+        </w:tc>
+        <w:tc>
+          <w:tcPr>
+            <w:tcW w:w="0" w:type="auto"/>
+            <w:hideMark/>
+          </w:tcPr>
+          <w:p>
+            <w:pPr>
+              <w:spacing w:line="276" w:lineRule="auto"/>
+              <w:jc w:val="center"/>
+              <w:cnfStyle w:val="000000100000" w:firstRow="0" w:lastRow="0" w:firstColumn="0" w:lastColumn="0" w:oddVBand="0" w:evenVBand="0" w:oddHBand="1" w:evenHBand="0" w:firstRowFirstColumn="0" w:firstRowLastColumn="0" w:lastRowFirstColumn="0" w:lastRowLastColumn="0"/>
+              <w:rPr>
+                <w:rFonts w:ascii="Times New Roman" w:hAnsi="Times New Roman" w:cs="Times New Roman"/>
+              </w:rPr>
+            </w:pPr>
+            <w:r>
+              <w:rPr>
+                <w:rFonts w:ascii="Times New Roman" w:hAnsi="Times New Roman" w:cs="Times New Roman"/>
+              </w:rPr>
+              <w:t>Manhattan</w:t>
+            </w:r>
+          </w:p>
+        </w:tc>
+        <w:tc>
+          <w:tcPr>
+            <w:tcW w:w="0" w:type="auto"/>
+            <w:hideMark/>
+          </w:tcPr>
+          <w:p>
+            <w:pPr>
+              <w:spacing w:line="276" w:lineRule="auto"/>
+              <w:jc w:val="center"/>
+              <w:cnfStyle w:val="000000100000" w:firstRow="0" w:lastRow="0" w:firstColumn="0" w:lastColumn="0" w:oddVBand="0" w:evenVBand="0" w:oddHBand="1" w:evenHBand="0" w:firstRowFirstColumn="0" w:firstRowLastColumn="0" w:lastRowFirstColumn="0" w:lastRowLastColumn="0"/>
+              <w:rPr>
+                <w:rFonts w:ascii="Times New Roman" w:hAnsi="Times New Roman" w:cs="Times New Roman"/>
+              </w:rPr>
+            </w:pPr>
+            <w:r>
+              <w:rPr>
+                <w:rFonts w:ascii="Times New Roman" w:hAnsi="Times New Roman" w:cs="Times New Roman"/>
+              </w:rPr>
+              <w:t>9</w:t>
+            </w:r>
+          </w:p>
+        </w:tc>
+        <w:tc>
+          <w:tcPr>
+            <w:tcW w:w="0" w:type="auto"/>
+            <w:hideMark/>
+          </w:tcPr>
+          <w:p>
+            <w:pPr>
+              <w:spacing w:line="276" w:lineRule="auto"/>
+              <w:jc w:val="center"/>
+              <w:cnfStyle w:val="000000100000" w:firstRow="0" w:lastRow="0" w:firstColumn="0" w:lastColumn="0" w:oddVBand="0" w:evenVBand="0" w:oddHBand="1" w:evenHBand="0" w:firstRowFirstColumn="0" w:firstRowLastColumn="0" w:lastRowFirstColumn="0" w:lastRowLastColumn="0"/>
+              <w:rPr>
+                <w:rFonts w:ascii="Times New Roman" w:hAnsi="Times New Roman" w:cs="Times New Roman"/>
+              </w:rPr>
+            </w:pPr>
+            <w:r>
+              <w:rPr>
+                <w:rFonts w:ascii="Times New Roman" w:hAnsi="Times New Roman" w:cs="Times New Roman"/>
+              </w:rPr>
+              <w:t>9</w:t>
+            </w:r>
+          </w:p>
+        </w:tc>
+        <w:tc>
+          <w:tcPr>
+            <w:tcW w:w="0" w:type="auto"/>
+            <w:hideMark/>
+          </w:tcPr>
+          <w:p>
+            <w:pPr>
+              <w:spacing w:line="276" w:lineRule="auto"/>
+              <w:jc w:val="center"/>
+              <w:cnfStyle w:val="000000100000" w:firstRow="0" w:lastRow="0" w:firstColumn="0" w:lastColumn="0" w:oddVBand="0" w:evenVBand="0" w:oddHBand="1" w:evenHBand="0" w:firstRowFirstColumn="0" w:firstRowLastColumn="0" w:lastRowFirstColumn="0" w:lastRowLastColumn="0"/>
+              <w:rPr>
+                <w:rFonts w:ascii="Times New Roman" w:hAnsi="Times New Roman" w:cs="Times New Roman"/>
+              </w:rPr>
+            </w:pPr>
+            <w:r>
+              <w:rPr>
+                <w:rFonts w:ascii="Times New Roman" w:hAnsi="Times New Roman" w:cs="Times New Roman"/>
+              </w:rPr>
+              <w:t>41</w:t>
+            </w:r>
+          </w:p>
+        </w:tc>
+        <w:tc>
+          <w:tcPr>
+            <w:tcW w:w="0" w:type="auto"/>
+            <w:hideMark/>
+          </w:tcPr>
+          <w:p>
+            <w:pPr>
+              <w:spacing w:line="276" w:lineRule="auto"/>
+              <w:jc w:val="center"/>
+              <w:cnfStyle w:val="000000100000" w:firstRow="0" w:lastRow="0" w:firstColumn="0" w:lastColumn="0" w:oddVBand="0" w:evenVBand="0" w:oddHBand="1" w:evenHBand="0" w:firstRowFirstColumn="0" w:firstRowLastColumn="0" w:lastRowFirstColumn="0" w:lastRowLastColumn="0"/>
+              <w:rPr>
+                <w:rFonts w:ascii="Times New Roman" w:hAnsi="Times New Roman" w:cs="Times New Roman"/>
+              </w:rPr>
+            </w:pPr>
+            <w:r>
+              <w:rPr>
+                <w:rFonts w:ascii="Times New Roman" w:hAnsi="Times New Roman" w:cs="Times New Roman"/>
+              </w:rPr>
+              <w:t>0.68</w:t>
+            </w:r>
+          </w:p>
+        </w:tc>
+      </w:tr>
+    </w:tbl>
+    <w:p/>
+    <w:p>
+      <w:pPr>
+        <w:rPr>
+          <w:rFonts w:ascii="Times New Roman" w:hAnsi="Times New Roman" w:cs="Times New Roman"/>
+          <w:b/>
+          <w:bCs/>
+          <w:sz w:val="24"/>
+          <w:szCs w:val="24"/>
+        </w:rPr>
+      </w:pPr>
+      <w:r>
+        <w:rPr>
+          <w:rFonts w:ascii="Times New Roman" w:hAnsi="Times New Roman" w:cs="Times New Roman"/>
+          <w:b/>
+          <w:bCs/>
+          <w:sz w:val="24"/>
+          <w:szCs w:val="24"/>
+        </w:rPr>
+        <w:t xml:space="preserve">Tabela </w:t>
+      </w:r>
+      <w:r>
+        <w:rPr>
+          <w:rFonts w:ascii="Times New Roman" w:hAnsi="Times New Roman" w:cs="Times New Roman"/>
+          <w:b/>
+          <w:bCs/>
+          <w:sz w:val="24"/>
+          <w:szCs w:val="24"/>
+        </w:rPr>
+        <w:t>2</w:t>
+      </w:r>
+      <w:r>
+        <w:rPr>
+          <w:rFonts w:ascii="Times New Roman" w:hAnsi="Times New Roman" w:cs="Times New Roman"/>
+          <w:b/>
+          <w:bCs/>
+          <w:sz w:val="24"/>
+          <w:szCs w:val="24"/>
+        </w:rPr>
+        <w:t xml:space="preserve">: Resultados para o Mapa </w:t>
+      </w:r>
+      <w:r>
+        <w:rPr>
+          <w:rFonts w:ascii="Times New Roman" w:hAnsi="Times New Roman" w:cs="Times New Roman"/>
+          <w:b/>
+          <w:bCs/>
+          <w:sz w:val="24"/>
+          <w:szCs w:val="24"/>
+        </w:rPr>
+        <w:t>2</w:t>
+      </w:r>
+      <w:r>
+        <w:rPr>
+          <w:rFonts w:ascii="Times New Roman" w:hAnsi="Times New Roman" w:cs="Times New Roman"/>
+          <w:b/>
+          <w:bCs/>
+          <w:sz w:val="24"/>
+          <w:szCs w:val="24"/>
+        </w:rPr>
+        <w:t xml:space="preserve"> (</w:t>
+      </w:r>
+      <w:r>
+        <w:rPr>
+          <w:rFonts w:ascii="Times New Roman" w:hAnsi="Times New Roman" w:cs="Times New Roman"/>
+          <w:b/>
+          <w:bCs/>
+          <w:sz w:val="24"/>
+          <w:szCs w:val="24"/>
+        </w:rPr>
+        <w:t>2</w:t>
+      </w:r>
+      <w:r>
+        <w:rPr>
+          <w:rFonts w:ascii="Times New Roman" w:hAnsi="Times New Roman" w:cs="Times New Roman"/>
+          <w:b/>
+          <w:bCs/>
+          <w:sz w:val="24"/>
+          <w:szCs w:val="24"/>
+        </w:rPr>
+        <w:t xml:space="preserve"> Caixas)</w:t>
+      </w:r>
+    </w:p>
+    <w:p/>
+    <w:tbl>
+      <w:tblPr>
+        <w:tblStyle w:val="SimplesTabela3"/>
+        <w:tblW w:w="0" w:type="auto"/>
+        <w:tblLook w:val="04A0" w:firstRow="1" w:lastRow="0" w:firstColumn="1" w:lastColumn="0" w:noHBand="0" w:noVBand="1"/>
+      </w:tblPr>
+      <w:tblGrid>
+        <w:gridCol w:w="1634"/>
+        <w:gridCol w:w="1610"/>
+        <w:gridCol w:w="974"/>
+        <w:gridCol w:w="1048"/>
+        <w:gridCol w:w="2178"/>
+        <w:gridCol w:w="1555"/>
+      </w:tblGrid>
+      <w:tr>
+        <w:trPr>
+          <w:cnfStyle w:val="100000000000" w:firstRow="1" w:lastRow="0" w:firstColumn="0" w:lastColumn="0" w:oddVBand="0" w:evenVBand="0" w:oddHBand="0" w:evenHBand="0" w:firstRowFirstColumn="0" w:firstRowLastColumn="0" w:lastRowFirstColumn="0" w:lastRowLastColumn="0"/>
+        </w:trPr>
+        <w:tc>
+          <w:tcPr>
+            <w:cnfStyle w:val="001000000100" w:firstRow="0" w:lastRow="0" w:firstColumn="1" w:lastColumn="0" w:oddVBand="0" w:evenVBand="0" w:oddHBand="0" w:evenHBand="0" w:firstRowFirstColumn="1" w:firstRowLastColumn="0" w:lastRowFirstColumn="0" w:lastRowLastColumn="0"/>
+            <w:tcW w:w="0" w:type="auto"/>
+            <w:hideMark/>
+          </w:tcPr>
+          <w:p>
+            <w:pPr>
+              <w:spacing w:line="276" w:lineRule="auto"/>
+              <w:rPr>
+                <w:rFonts w:ascii="Times New Roman" w:hAnsi="Times New Roman" w:cs="Times New Roman"/>
+              </w:rPr>
+            </w:pPr>
+            <w:r>
+              <w:rPr>
+                <w:rFonts w:ascii="Times New Roman" w:hAnsi="Times New Roman" w:cs="Times New Roman"/>
+              </w:rPr>
+              <w:t>Algoritmo</w:t>
+            </w:r>
+          </w:p>
+        </w:tc>
+        <w:tc>
+          <w:tcPr>
+            <w:tcW w:w="0" w:type="auto"/>
+            <w:hideMark/>
+          </w:tcPr>
+          <w:p>
+            <w:pPr>
+              <w:spacing w:line="276" w:lineRule="auto"/>
+              <w:cnfStyle w:val="100000000000" w:firstRow="1" w:lastRow="0" w:firstColumn="0" w:lastColumn="0" w:oddVBand="0" w:evenVBand="0" w:oddHBand="0" w:evenHBand="0" w:firstRowFirstColumn="0" w:firstRowLastColumn="0" w:lastRowFirstColumn="0" w:lastRowLastColumn="0"/>
+              <w:rPr>
+                <w:rFonts w:ascii="Times New Roman" w:hAnsi="Times New Roman" w:cs="Times New Roman"/>
+              </w:rPr>
+            </w:pPr>
+            <w:r>
+              <w:rPr>
+                <w:rFonts w:ascii="Times New Roman" w:hAnsi="Times New Roman" w:cs="Times New Roman"/>
+              </w:rPr>
+              <w:t>Heurística</w:t>
+            </w:r>
+          </w:p>
+        </w:tc>
+        <w:tc>
+          <w:tcPr>
+            <w:tcW w:w="0" w:type="auto"/>
+            <w:hideMark/>
+          </w:tcPr>
+          <w:p>
+            <w:pPr>
+              <w:spacing w:line="276" w:lineRule="auto"/>
+              <w:cnfStyle w:val="100000000000" w:firstRow="1" w:lastRow="0" w:firstColumn="0" w:lastColumn="0" w:oddVBand="0" w:evenVBand="0" w:oddHBand="0" w:evenHBand="0" w:firstRowFirstColumn="0" w:firstRowLastColumn="0" w:lastRowFirstColumn="0" w:lastRowLastColumn="0"/>
+              <w:rPr>
+                <w:rFonts w:ascii="Times New Roman" w:hAnsi="Times New Roman" w:cs="Times New Roman"/>
+              </w:rPr>
+            </w:pPr>
+            <w:r>
+              <w:rPr>
+                <w:rFonts w:ascii="Times New Roman" w:hAnsi="Times New Roman" w:cs="Times New Roman"/>
+              </w:rPr>
+              <w:t>Custo</w:t>
+            </w:r>
+          </w:p>
+        </w:tc>
+        <w:tc>
+          <w:tcPr>
+            <w:tcW w:w="0" w:type="auto"/>
+            <w:hideMark/>
+          </w:tcPr>
+          <w:p>
+            <w:pPr>
+              <w:spacing w:line="276" w:lineRule="auto"/>
+              <w:cnfStyle w:val="100000000000" w:firstRow="1" w:lastRow="0" w:firstColumn="0" w:lastColumn="0" w:oddVBand="0" w:evenVBand="0" w:oddHBand="0" w:evenHBand="0" w:firstRowFirstColumn="0" w:firstRowLastColumn="0" w:lastRowFirstColumn="0" w:lastRowLastColumn="0"/>
+              <w:rPr>
+                <w:rFonts w:ascii="Times New Roman" w:hAnsi="Times New Roman" w:cs="Times New Roman"/>
+              </w:rPr>
+            </w:pPr>
+            <w:r>
+              <w:rPr>
+                <w:rFonts w:ascii="Times New Roman" w:hAnsi="Times New Roman" w:cs="Times New Roman"/>
+              </w:rPr>
+              <w:t>Passos</w:t>
+            </w:r>
+          </w:p>
+        </w:tc>
+        <w:tc>
+          <w:tcPr>
+            <w:tcW w:w="0" w:type="auto"/>
+            <w:hideMark/>
+          </w:tcPr>
+          <w:p>
+            <w:pPr>
+              <w:spacing w:line="276" w:lineRule="auto"/>
+              <w:cnfStyle w:val="100000000000" w:firstRow="1" w:lastRow="0" w:firstColumn="0" w:lastColumn="0" w:oddVBand="0" w:evenVBand="0" w:oddHBand="0" w:evenHBand="0" w:firstRowFirstColumn="0" w:firstRowLastColumn="0" w:lastRowFirstColumn="0" w:lastRowLastColumn="0"/>
+              <w:rPr>
+                <w:rFonts w:ascii="Times New Roman" w:hAnsi="Times New Roman" w:cs="Times New Roman"/>
+              </w:rPr>
+            </w:pPr>
+            <w:r>
+              <w:rPr>
+                <w:rFonts w:ascii="Times New Roman" w:hAnsi="Times New Roman" w:cs="Times New Roman"/>
+              </w:rPr>
+              <w:t>Nós expandidos</w:t>
+            </w:r>
+          </w:p>
+        </w:tc>
+        <w:tc>
+          <w:tcPr>
+            <w:tcW w:w="0" w:type="auto"/>
+            <w:hideMark/>
+          </w:tcPr>
+          <w:p>
+            <w:pPr>
+              <w:spacing w:line="276" w:lineRule="auto"/>
+              <w:cnfStyle w:val="100000000000" w:firstRow="1" w:lastRow="0" w:firstColumn="0" w:lastColumn="0" w:oddVBand="0" w:evenVBand="0" w:oddHBand="0" w:evenHBand="0" w:firstRowFirstColumn="0" w:firstRowLastColumn="0" w:lastRowFirstColumn="0" w:lastRowLastColumn="0"/>
+              <w:rPr>
+                <w:rFonts w:ascii="Times New Roman" w:hAnsi="Times New Roman" w:cs="Times New Roman"/>
+              </w:rPr>
+            </w:pPr>
+            <w:r>
+              <w:rPr>
+                <w:rFonts w:ascii="Times New Roman" w:hAnsi="Times New Roman" w:cs="Times New Roman"/>
+              </w:rPr>
+              <w:t>Tempo (ms)</w:t>
+            </w:r>
+          </w:p>
+        </w:tc>
+      </w:tr>
+      <w:tr>
+        <w:trPr>
+          <w:cnfStyle w:val="000000100000" w:firstRow="0" w:lastRow="0" w:firstColumn="0" w:lastColumn="0" w:oddVBand="0" w:evenVBand="0" w:oddHBand="1" w:evenHBand="0" w:firstRowFirstColumn="0" w:firstRowLastColumn="0" w:lastRowFirstColumn="0" w:lastRowLastColumn="0"/>
+        </w:trPr>
+        <w:tc>
+          <w:tcPr>
+            <w:cnfStyle w:val="001000000000" w:firstRow="0" w:lastRow="0" w:firstColumn="1" w:lastColumn="0" w:oddVBand="0" w:evenVBand="0" w:oddHBand="0" w:evenHBand="0" w:firstRowFirstColumn="0" w:firstRowLastColumn="0" w:lastRowFirstColumn="0" w:lastRowLastColumn="0"/>
+            <w:tcW w:w="0" w:type="auto"/>
+            <w:hideMark/>
+          </w:tcPr>
+          <w:p>
+            <w:pPr>
+              <w:spacing w:line="276" w:lineRule="auto"/>
+              <w:rPr>
+                <w:rFonts w:ascii="Times New Roman" w:hAnsi="Times New Roman" w:cs="Times New Roman"/>
+              </w:rPr>
+            </w:pPr>
+            <w:r>
+              <w:rPr>
+                <w:rFonts w:ascii="Times New Roman" w:hAnsi="Times New Roman" w:cs="Times New Roman"/>
+              </w:rPr>
+              <w:t>UCS</w:t>
+            </w:r>
+          </w:p>
+        </w:tc>
+        <w:tc>
+          <w:tcPr>
+            <w:tcW w:w="0" w:type="auto"/>
+            <w:hideMark/>
+          </w:tcPr>
+          <w:p>
+            <w:pPr>
+              <w:spacing w:line="276" w:lineRule="auto"/>
+              <w:cnfStyle w:val="000000100000" w:firstRow="0" w:lastRow="0" w:firstColumn="0" w:lastColumn="0" w:oddVBand="0" w:evenVBand="0" w:oddHBand="1" w:evenHBand="0" w:firstRowFirstColumn="0" w:firstRowLastColumn="0" w:lastRowFirstColumn="0" w:lastRowLastColumn="0"/>
+              <w:rPr>
+                <w:rFonts w:ascii="Times New Roman" w:hAnsi="Times New Roman" w:cs="Times New Roman"/>
+              </w:rPr>
+            </w:pPr>
+            <w:r>
+              <w:rPr>
+                <w:rFonts w:ascii="Times New Roman" w:hAnsi="Times New Roman" w:cs="Times New Roman"/>
+              </w:rPr>
+              <w:t>Não usa</w:t>
+            </w:r>
+          </w:p>
+        </w:tc>
+        <w:tc>
+          <w:tcPr>
+            <w:tcW w:w="0" w:type="auto"/>
+          </w:tcPr>
+          <w:p>
+            <w:pPr>
+              <w:spacing w:line="276" w:lineRule="auto"/>
+              <w:jc w:val="center"/>
+              <w:cnfStyle w:val="000000100000" w:firstRow="0" w:lastRow="0" w:firstColumn="0" w:lastColumn="0" w:oddVBand="0" w:evenVBand="0" w:oddHBand="1" w:evenHBand="0" w:firstRowFirstColumn="0" w:firstRowLastColumn="0" w:lastRowFirstColumn="0" w:lastRowLastColumn="0"/>
+              <w:rPr>
+                <w:rFonts w:ascii="Times New Roman" w:hAnsi="Times New Roman" w:cs="Times New Roman"/>
+              </w:rPr>
+            </w:pPr>
+            <w:r>
+              <w:rPr>
+                <w:rFonts w:ascii="Times New Roman" w:hAnsi="Times New Roman" w:cs="Times New Roman"/>
+              </w:rPr>
+              <w:t>17</w:t>
+            </w:r>
+          </w:p>
+        </w:tc>
+        <w:tc>
+          <w:tcPr>
+            <w:tcW w:w="0" w:type="auto"/>
+          </w:tcPr>
+          <w:p>
+            <w:pPr>
+              <w:spacing w:line="276" w:lineRule="auto"/>
+              <w:jc w:val="center"/>
+              <w:cnfStyle w:val="000000100000" w:firstRow="0" w:lastRow="0" w:firstColumn="0" w:lastColumn="0" w:oddVBand="0" w:evenVBand="0" w:oddHBand="1" w:evenHBand="0" w:firstRowFirstColumn="0" w:firstRowLastColumn="0" w:lastRowFirstColumn="0" w:lastRowLastColumn="0"/>
+              <w:rPr>
+                <w:rFonts w:ascii="Times New Roman" w:hAnsi="Times New Roman" w:cs="Times New Roman"/>
+              </w:rPr>
+            </w:pPr>
+            <w:r>
+              <w:rPr>
+                <w:rFonts w:ascii="Times New Roman" w:hAnsi="Times New Roman" w:cs="Times New Roman"/>
+              </w:rPr>
+              <w:t>17</w:t>
+            </w:r>
+          </w:p>
+        </w:tc>
+        <w:tc>
+          <w:tcPr>
+            <w:tcW w:w="0" w:type="auto"/>
+          </w:tcPr>
+          <w:p>
+            <w:pPr>
+              <w:spacing w:line="276" w:lineRule="auto"/>
+              <w:jc w:val="center"/>
+              <w:cnfStyle w:val="000000100000" w:firstRow="0" w:lastRow="0" w:firstColumn="0" w:lastColumn="0" w:oddVBand="0" w:evenVBand="0" w:oddHBand="1" w:evenHBand="0" w:firstRowFirstColumn="0" w:firstRowLastColumn="0" w:lastRowFirstColumn="0" w:lastRowLastColumn="0"/>
+              <w:rPr>
+                <w:rFonts w:ascii="Times New Roman" w:hAnsi="Times New Roman" w:cs="Times New Roman"/>
+              </w:rPr>
+            </w:pPr>
+            <w:r>
+              <w:rPr>
+                <w:rFonts w:ascii="Times New Roman" w:hAnsi="Times New Roman" w:cs="Times New Roman"/>
+              </w:rPr>
+              <w:t>1439</w:t>
+            </w:r>
+          </w:p>
+        </w:tc>
+        <w:tc>
+          <w:tcPr>
+            <w:tcW w:w="0" w:type="auto"/>
+          </w:tcPr>
+          <w:p>
+            <w:pPr>
+              <w:spacing w:line="276" w:lineRule="auto"/>
+              <w:jc w:val="center"/>
+              <w:cnfStyle w:val="000000100000" w:firstRow="0" w:lastRow="0" w:firstColumn="0" w:lastColumn="0" w:oddVBand="0" w:evenVBand="0" w:oddHBand="1" w:evenHBand="0" w:firstRowFirstColumn="0" w:firstRowLastColumn="0" w:lastRowFirstColumn="0" w:lastRowLastColumn="0"/>
+              <w:rPr>
+                <w:rFonts w:ascii="Times New Roman" w:hAnsi="Times New Roman" w:cs="Times New Roman"/>
+              </w:rPr>
+            </w:pPr>
+            <w:r>
+              <w:rPr>
+                <w:rFonts w:ascii="Times New Roman" w:hAnsi="Times New Roman" w:cs="Times New Roman"/>
+              </w:rPr>
+              <w:t>28.03</w:t>
+            </w:r>
+          </w:p>
+        </w:tc>
+      </w:tr>
+      <w:tr>
+        <w:tc>
+          <w:tcPr>
+            <w:cnfStyle w:val="001000000000" w:firstRow="0" w:lastRow="0" w:firstColumn="1" w:lastColumn="0" w:oddVBand="0" w:evenVBand="0" w:oddHBand="0" w:evenHBand="0" w:firstRowFirstColumn="0" w:firstRowLastColumn="0" w:lastRowFirstColumn="0" w:lastRowLastColumn="0"/>
+            <w:tcW w:w="0" w:type="auto"/>
+            <w:hideMark/>
+          </w:tcPr>
+          <w:p>
+            <w:pPr>
+              <w:spacing w:line="276" w:lineRule="auto"/>
+              <w:rPr>
+                <w:rFonts w:ascii="Times New Roman" w:hAnsi="Times New Roman" w:cs="Times New Roman"/>
+              </w:rPr>
+            </w:pPr>
+            <w:r>
+              <w:rPr>
+                <w:rFonts w:ascii="Times New Roman" w:hAnsi="Times New Roman" w:cs="Times New Roman"/>
+              </w:rPr>
+              <w:t>Gulosa</w:t>
+            </w:r>
+          </w:p>
+        </w:tc>
+        <w:tc>
+          <w:tcPr>
+            <w:tcW w:w="0" w:type="auto"/>
+            <w:hideMark/>
+          </w:tcPr>
+          <w:p>
+            <w:pPr>
+              <w:spacing w:line="276" w:lineRule="auto"/>
+              <w:cnfStyle w:val="000000000000" w:firstRow="0" w:lastRow="0" w:firstColumn="0" w:lastColumn="0" w:oddVBand="0" w:evenVBand="0" w:oddHBand="0" w:evenHBand="0" w:firstRowFirstColumn="0" w:firstRowLastColumn="0" w:lastRowFirstColumn="0" w:lastRowLastColumn="0"/>
+              <w:rPr>
+                <w:rFonts w:ascii="Times New Roman" w:hAnsi="Times New Roman" w:cs="Times New Roman"/>
+              </w:rPr>
+            </w:pPr>
+            <w:r>
+              <w:rPr>
+                <w:rFonts w:ascii="Times New Roman" w:hAnsi="Times New Roman" w:cs="Times New Roman"/>
+              </w:rPr>
+              <w:t>Manhattan</w:t>
+            </w:r>
+          </w:p>
+        </w:tc>
+        <w:tc>
+          <w:tcPr>
+            <w:tcW w:w="0" w:type="auto"/>
+            <w:hideMark/>
+          </w:tcPr>
+          <w:p>
+            <w:pPr>
+              <w:spacing w:line="276" w:lineRule="auto"/>
+              <w:jc w:val="center"/>
+              <w:cnfStyle w:val="000000000000" w:firstRow="0" w:lastRow="0" w:firstColumn="0" w:lastColumn="0" w:oddVBand="0" w:evenVBand="0" w:oddHBand="0" w:evenHBand="0" w:firstRowFirstColumn="0" w:firstRowLastColumn="0" w:lastRowFirstColumn="0" w:lastRowLastColumn="0"/>
+              <w:rPr>
+                <w:rFonts w:ascii="Times New Roman" w:hAnsi="Times New Roman" w:cs="Times New Roman"/>
+              </w:rPr>
+            </w:pPr>
+            <w:r>
+              <w:rPr>
+                <w:rFonts w:ascii="Times New Roman" w:hAnsi="Times New Roman" w:cs="Times New Roman"/>
+              </w:rPr>
+              <w:t>25</w:t>
+            </w:r>
+          </w:p>
+        </w:tc>
+        <w:tc>
+          <w:tcPr>
+            <w:tcW w:w="0" w:type="auto"/>
+            <w:hideMark/>
+          </w:tcPr>
+          <w:p>
+            <w:pPr>
+              <w:spacing w:line="276" w:lineRule="auto"/>
+              <w:jc w:val="center"/>
+              <w:cnfStyle w:val="000000000000" w:firstRow="0" w:lastRow="0" w:firstColumn="0" w:lastColumn="0" w:oddVBand="0" w:evenVBand="0" w:oddHBand="0" w:evenHBand="0" w:firstRowFirstColumn="0" w:firstRowLastColumn="0" w:lastRowFirstColumn="0" w:lastRowLastColumn="0"/>
+              <w:rPr>
+                <w:rFonts w:ascii="Times New Roman" w:hAnsi="Times New Roman" w:cs="Times New Roman"/>
+              </w:rPr>
+            </w:pPr>
+            <w:r>
+              <w:rPr>
+                <w:rFonts w:ascii="Times New Roman" w:hAnsi="Times New Roman" w:cs="Times New Roman"/>
+              </w:rPr>
+              <w:t>25</w:t>
+            </w:r>
+          </w:p>
+        </w:tc>
+        <w:tc>
+          <w:tcPr>
+            <w:tcW w:w="0" w:type="auto"/>
+            <w:hideMark/>
+          </w:tcPr>
+          <w:p>
+            <w:pPr>
+              <w:spacing w:line="276" w:lineRule="auto"/>
+              <w:jc w:val="center"/>
+              <w:cnfStyle w:val="000000000000" w:firstRow="0" w:lastRow="0" w:firstColumn="0" w:lastColumn="0" w:oddVBand="0" w:evenVBand="0" w:oddHBand="0" w:evenHBand="0" w:firstRowFirstColumn="0" w:firstRowLastColumn="0" w:lastRowFirstColumn="0" w:lastRowLastColumn="0"/>
+              <w:rPr>
+                <w:rFonts w:ascii="Times New Roman" w:hAnsi="Times New Roman" w:cs="Times New Roman"/>
+              </w:rPr>
+            </w:pPr>
+            <w:r>
+              <w:rPr>
+                <w:rFonts w:ascii="Times New Roman" w:hAnsi="Times New Roman" w:cs="Times New Roman"/>
+              </w:rPr>
+              <w:t>89</w:t>
+            </w:r>
+          </w:p>
+        </w:tc>
+        <w:tc>
+          <w:tcPr>
+            <w:tcW w:w="0" w:type="auto"/>
+            <w:hideMark/>
+          </w:tcPr>
+          <w:p>
+            <w:pPr>
+              <w:spacing w:line="276" w:lineRule="auto"/>
+              <w:jc w:val="center"/>
+              <w:cnfStyle w:val="000000000000" w:firstRow="0" w:lastRow="0" w:firstColumn="0" w:lastColumn="0" w:oddVBand="0" w:evenVBand="0" w:oddHBand="0" w:evenHBand="0" w:firstRowFirstColumn="0" w:firstRowLastColumn="0" w:lastRowFirstColumn="0" w:lastRowLastColumn="0"/>
+              <w:rPr>
+                <w:rFonts w:ascii="Times New Roman" w:hAnsi="Times New Roman" w:cs="Times New Roman"/>
+              </w:rPr>
+            </w:pPr>
+            <w:r>
+              <w:rPr>
+                <w:rFonts w:ascii="Times New Roman" w:hAnsi="Times New Roman" w:cs="Times New Roman"/>
+              </w:rPr>
+              <w:t>1.23</w:t>
+            </w:r>
+          </w:p>
+        </w:tc>
+      </w:tr>
+      <w:tr>
+        <w:trPr>
+          <w:cnfStyle w:val="000000100000" w:firstRow="0" w:lastRow="0" w:firstColumn="0" w:lastColumn="0" w:oddVBand="0" w:evenVBand="0" w:oddHBand="1" w:evenHBand="0" w:firstRowFirstColumn="0" w:firstRowLastColumn="0" w:lastRowFirstColumn="0" w:lastRowLastColumn="0"/>
+        </w:trPr>
+        <w:tc>
+          <w:tcPr>
+            <w:cnfStyle w:val="001000000000" w:firstRow="0" w:lastRow="0" w:firstColumn="1" w:lastColumn="0" w:oddVBand="0" w:evenVBand="0" w:oddHBand="0" w:evenHBand="0" w:firstRowFirstColumn="0" w:firstRowLastColumn="0" w:lastRowFirstColumn="0" w:lastRowLastColumn="0"/>
+            <w:tcW w:w="0" w:type="auto"/>
+            <w:hideMark/>
+          </w:tcPr>
+          <w:p>
+            <w:pPr>
+              <w:spacing w:line="276" w:lineRule="auto"/>
+              <w:rPr>
+                <w:rFonts w:ascii="Times New Roman" w:hAnsi="Times New Roman" w:cs="Times New Roman"/>
+              </w:rPr>
+            </w:pPr>
+            <w:r>
+              <w:rPr>
+                <w:rFonts w:ascii="Times New Roman" w:hAnsi="Times New Roman" w:cs="Times New Roman"/>
+              </w:rPr>
+              <w:t>A*</w:t>
+            </w:r>
+          </w:p>
+        </w:tc>
+        <w:tc>
+          <w:tcPr>
+            <w:tcW w:w="0" w:type="auto"/>
+            <w:hideMark/>
+          </w:tcPr>
+          <w:p>
+            <w:pPr>
+              <w:spacing w:line="276" w:lineRule="auto"/>
+              <w:cnfStyle w:val="000000100000" w:firstRow="0" w:lastRow="0" w:firstColumn="0" w:lastColumn="0" w:oddVBand="0" w:evenVBand="0" w:oddHBand="1" w:evenHBand="0" w:firstRowFirstColumn="0" w:firstRowLastColumn="0" w:lastRowFirstColumn="0" w:lastRowLastColumn="0"/>
+              <w:rPr>
+                <w:rFonts w:ascii="Times New Roman" w:hAnsi="Times New Roman" w:cs="Times New Roman"/>
+              </w:rPr>
+            </w:pPr>
+            <w:r>
+              <w:rPr>
+                <w:rFonts w:ascii="Times New Roman" w:hAnsi="Times New Roman" w:cs="Times New Roman"/>
+              </w:rPr>
+              <w:t>Manhattan</w:t>
+            </w:r>
+          </w:p>
+        </w:tc>
+        <w:tc>
+          <w:tcPr>
+            <w:tcW w:w="0" w:type="auto"/>
+          </w:tcPr>
+          <w:p>
+            <w:pPr>
+              <w:spacing w:line="276" w:lineRule="auto"/>
+              <w:jc w:val="center"/>
+              <w:cnfStyle w:val="000000100000" w:firstRow="0" w:lastRow="0" w:firstColumn="0" w:lastColumn="0" w:oddVBand="0" w:evenVBand="0" w:oddHBand="1" w:evenHBand="0" w:firstRowFirstColumn="0" w:firstRowLastColumn="0" w:lastRowFirstColumn="0" w:lastRowLastColumn="0"/>
+              <w:rPr>
+                <w:rFonts w:ascii="Times New Roman" w:hAnsi="Times New Roman" w:cs="Times New Roman"/>
+              </w:rPr>
+            </w:pPr>
+            <w:r>
+              <w:rPr>
+                <w:rFonts w:ascii="Times New Roman" w:hAnsi="Times New Roman" w:cs="Times New Roman"/>
+              </w:rPr>
+              <w:t>17</w:t>
+            </w:r>
+          </w:p>
+        </w:tc>
+        <w:tc>
+          <w:tcPr>
+            <w:tcW w:w="0" w:type="auto"/>
+          </w:tcPr>
+          <w:p>
+            <w:pPr>
+              <w:spacing w:line="276" w:lineRule="auto"/>
+              <w:jc w:val="center"/>
+              <w:cnfStyle w:val="000000100000" w:firstRow="0" w:lastRow="0" w:firstColumn="0" w:lastColumn="0" w:oddVBand="0" w:evenVBand="0" w:oddHBand="1" w:evenHBand="0" w:firstRowFirstColumn="0" w:firstRowLastColumn="0" w:lastRowFirstColumn="0" w:lastRowLastColumn="0"/>
+              <w:rPr>
+                <w:rFonts w:ascii="Times New Roman" w:hAnsi="Times New Roman" w:cs="Times New Roman"/>
+              </w:rPr>
+            </w:pPr>
+            <w:r>
+              <w:rPr>
+                <w:rFonts w:ascii="Times New Roman" w:hAnsi="Times New Roman" w:cs="Times New Roman"/>
+              </w:rPr>
+              <w:t>17</w:t>
+            </w:r>
+          </w:p>
+        </w:tc>
+        <w:tc>
+          <w:tcPr>
+            <w:tcW w:w="0" w:type="auto"/>
+          </w:tcPr>
+          <w:p>
+            <w:pPr>
+              <w:spacing w:line="276" w:lineRule="auto"/>
+              <w:jc w:val="center"/>
+              <w:cnfStyle w:val="000000100000" w:firstRow="0" w:lastRow="0" w:firstColumn="0" w:lastColumn="0" w:oddVBand="0" w:evenVBand="0" w:oddHBand="1" w:evenHBand="0" w:firstRowFirstColumn="0" w:firstRowLastColumn="0" w:lastRowFirstColumn="0" w:lastRowLastColumn="0"/>
+              <w:rPr>
+                <w:rFonts w:ascii="Times New Roman" w:hAnsi="Times New Roman" w:cs="Times New Roman"/>
+              </w:rPr>
+            </w:pPr>
+            <w:r>
+              <w:rPr>
+                <w:rFonts w:ascii="Times New Roman" w:hAnsi="Times New Roman" w:cs="Times New Roman"/>
+              </w:rPr>
+              <w:t>406</w:t>
+            </w:r>
+          </w:p>
+        </w:tc>
+        <w:tc>
+          <w:tcPr>
+            <w:tcW w:w="0" w:type="auto"/>
+          </w:tcPr>
+          <w:p>
+            <w:pPr>
+              <w:spacing w:line="276" w:lineRule="auto"/>
+              <w:jc w:val="center"/>
+              <w:cnfStyle w:val="000000100000" w:firstRow="0" w:lastRow="0" w:firstColumn="0" w:lastColumn="0" w:oddVBand="0" w:evenVBand="0" w:oddHBand="1" w:evenHBand="0" w:firstRowFirstColumn="0" w:firstRowLastColumn="0" w:lastRowFirstColumn="0" w:lastRowLastColumn="0"/>
+              <w:rPr>
+                <w:rFonts w:ascii="Times New Roman" w:hAnsi="Times New Roman" w:cs="Times New Roman"/>
+              </w:rPr>
+            </w:pPr>
+            <w:r>
+              <w:rPr>
+                <w:rFonts w:ascii="Times New Roman" w:hAnsi="Times New Roman" w:cs="Times New Roman"/>
+              </w:rPr>
+              <w:t>6.73</w:t>
+            </w:r>
+          </w:p>
+        </w:tc>
+      </w:tr>
+    </w:tbl>
+    <w:p/>
+    <w:p/>
+    <w:p>
+      <w:pPr>
+        <w:rPr>
+          <w:rFonts w:ascii="Times New Roman" w:hAnsi="Times New Roman" w:cs="Times New Roman"/>
+          <w:b/>
+          <w:bCs/>
+          <w:sz w:val="24"/>
+          <w:szCs w:val="24"/>
+        </w:rPr>
+      </w:pPr>
+      <w:r>
+        <w:rPr>
+          <w:rFonts w:ascii="Times New Roman" w:hAnsi="Times New Roman" w:cs="Times New Roman"/>
+          <w:b/>
+          <w:bCs/>
+          <w:sz w:val="24"/>
+          <w:szCs w:val="24"/>
+        </w:rPr>
+        <w:t xml:space="preserve">Tabela </w:t>
+      </w:r>
+      <w:r>
+        <w:rPr>
+          <w:rFonts w:ascii="Times New Roman" w:hAnsi="Times New Roman" w:cs="Times New Roman"/>
+          <w:b/>
+          <w:bCs/>
+          <w:sz w:val="24"/>
+          <w:szCs w:val="24"/>
+        </w:rPr>
+        <w:t>3</w:t>
+      </w:r>
+      <w:r>
+        <w:rPr>
+          <w:rFonts w:ascii="Times New Roman" w:hAnsi="Times New Roman" w:cs="Times New Roman"/>
+          <w:b/>
+          <w:bCs/>
+          <w:sz w:val="24"/>
+          <w:szCs w:val="24"/>
+        </w:rPr>
+        <w:t xml:space="preserve">: Resultados para o Mapa </w:t>
+      </w:r>
+      <w:r>
+        <w:rPr>
+          <w:rFonts w:ascii="Times New Roman" w:hAnsi="Times New Roman" w:cs="Times New Roman"/>
+          <w:b/>
+          <w:bCs/>
+          <w:sz w:val="24"/>
+          <w:szCs w:val="24"/>
+        </w:rPr>
+        <w:t>3</w:t>
+      </w:r>
+      <w:r>
+        <w:rPr>
+          <w:rFonts w:ascii="Times New Roman" w:hAnsi="Times New Roman" w:cs="Times New Roman"/>
+          <w:b/>
+          <w:bCs/>
+          <w:sz w:val="24"/>
+          <w:szCs w:val="24"/>
+        </w:rPr>
+        <w:t xml:space="preserve"> (</w:t>
+      </w:r>
+      <w:r>
+        <w:rPr>
+          <w:rFonts w:ascii="Times New Roman" w:hAnsi="Times New Roman" w:cs="Times New Roman"/>
+          <w:b/>
+          <w:bCs/>
+          <w:sz w:val="24"/>
+          <w:szCs w:val="24"/>
+        </w:rPr>
+        <w:t>3</w:t>
+      </w:r>
+      <w:r>
+        <w:rPr>
+          <w:rFonts w:ascii="Times New Roman" w:hAnsi="Times New Roman" w:cs="Times New Roman"/>
+          <w:b/>
+          <w:bCs/>
+          <w:sz w:val="24"/>
+          <w:szCs w:val="24"/>
+        </w:rPr>
+        <w:t xml:space="preserve"> Caixas)</w:t>
+      </w:r>
+    </w:p>
+    <w:p>
+      <w:pPr>
+        <w:rPr>
+          <w:rFonts w:ascii="Times New Roman" w:hAnsi="Times New Roman" w:cs="Times New Roman"/>
+          <w:sz w:val="24"/>
+          <w:szCs w:val="24"/>
+        </w:rPr>
+      </w:pPr>
+    </w:p>
+    <w:tbl>
+      <w:tblPr>
+        <w:tblStyle w:val="SimplesTabela3"/>
+        <w:tblW w:w="0" w:type="auto"/>
+        <w:tblLook w:val="04A0" w:firstRow="1" w:lastRow="0" w:firstColumn="1" w:lastColumn="0" w:noHBand="0" w:noVBand="1"/>
+      </w:tblPr>
+      <w:tblGrid>
+        <w:gridCol w:w="1634"/>
+        <w:gridCol w:w="1610"/>
+        <w:gridCol w:w="974"/>
+        <w:gridCol w:w="1048"/>
+        <w:gridCol w:w="2178"/>
+        <w:gridCol w:w="1555"/>
+      </w:tblGrid>
+      <w:tr>
+        <w:trPr>
+          <w:cnfStyle w:val="100000000000" w:firstRow="1" w:lastRow="0" w:firstColumn="0" w:lastColumn="0" w:oddVBand="0" w:evenVBand="0" w:oddHBand="0" w:evenHBand="0" w:firstRowFirstColumn="0" w:firstRowLastColumn="0" w:lastRowFirstColumn="0" w:lastRowLastColumn="0"/>
+        </w:trPr>
+        <w:tc>
+          <w:tcPr>
+            <w:cnfStyle w:val="001000000100" w:firstRow="0" w:lastRow="0" w:firstColumn="1" w:lastColumn="0" w:oddVBand="0" w:evenVBand="0" w:oddHBand="0" w:evenHBand="0" w:firstRowFirstColumn="1" w:firstRowLastColumn="0" w:lastRowFirstColumn="0" w:lastRowLastColumn="0"/>
+            <w:tcW w:w="0" w:type="auto"/>
+            <w:hideMark/>
+          </w:tcPr>
+          <w:p>
+            <w:pPr>
+              <w:spacing w:line="276" w:lineRule="auto"/>
+              <w:rPr>
+                <w:rFonts w:ascii="Times New Roman" w:hAnsi="Times New Roman" w:cs="Times New Roman"/>
+              </w:rPr>
+            </w:pPr>
+            <w:r>
+              <w:rPr>
+                <w:rFonts w:ascii="Times New Roman" w:hAnsi="Times New Roman" w:cs="Times New Roman"/>
+              </w:rPr>
+              <w:t>Algoritmo</w:t>
+            </w:r>
+          </w:p>
+        </w:tc>
+        <w:tc>
+          <w:tcPr>
+            <w:tcW w:w="0" w:type="auto"/>
+            <w:hideMark/>
+          </w:tcPr>
+          <w:p>
+            <w:pPr>
+              <w:spacing w:line="276" w:lineRule="auto"/>
+              <w:cnfStyle w:val="100000000000" w:firstRow="1" w:lastRow="0" w:firstColumn="0" w:lastColumn="0" w:oddVBand="0" w:evenVBand="0" w:oddHBand="0" w:evenHBand="0" w:firstRowFirstColumn="0" w:firstRowLastColumn="0" w:lastRowFirstColumn="0" w:lastRowLastColumn="0"/>
+              <w:rPr>
+                <w:rFonts w:ascii="Times New Roman" w:hAnsi="Times New Roman" w:cs="Times New Roman"/>
+              </w:rPr>
+            </w:pPr>
+            <w:r>
+              <w:rPr>
+                <w:rFonts w:ascii="Times New Roman" w:hAnsi="Times New Roman" w:cs="Times New Roman"/>
+              </w:rPr>
+              <w:t>Heurística</w:t>
+            </w:r>
+          </w:p>
+        </w:tc>
+        <w:tc>
+          <w:tcPr>
+            <w:tcW w:w="0" w:type="auto"/>
+            <w:hideMark/>
+          </w:tcPr>
+          <w:p>
+            <w:pPr>
+              <w:spacing w:line="276" w:lineRule="auto"/>
+              <w:cnfStyle w:val="100000000000" w:firstRow="1" w:lastRow="0" w:firstColumn="0" w:lastColumn="0" w:oddVBand="0" w:evenVBand="0" w:oddHBand="0" w:evenHBand="0" w:firstRowFirstColumn="0" w:firstRowLastColumn="0" w:lastRowFirstColumn="0" w:lastRowLastColumn="0"/>
+              <w:rPr>
+                <w:rFonts w:ascii="Times New Roman" w:hAnsi="Times New Roman" w:cs="Times New Roman"/>
+              </w:rPr>
+            </w:pPr>
+            <w:r>
+              <w:rPr>
+                <w:rFonts w:ascii="Times New Roman" w:hAnsi="Times New Roman" w:cs="Times New Roman"/>
+              </w:rPr>
+              <w:t>Custo</w:t>
+            </w:r>
+          </w:p>
+        </w:tc>
+        <w:tc>
+          <w:tcPr>
+            <w:tcW w:w="0" w:type="auto"/>
+            <w:hideMark/>
+          </w:tcPr>
+          <w:p>
+            <w:pPr>
+              <w:spacing w:line="276" w:lineRule="auto"/>
+              <w:cnfStyle w:val="100000000000" w:firstRow="1" w:lastRow="0" w:firstColumn="0" w:lastColumn="0" w:oddVBand="0" w:evenVBand="0" w:oddHBand="0" w:evenHBand="0" w:firstRowFirstColumn="0" w:firstRowLastColumn="0" w:lastRowFirstColumn="0" w:lastRowLastColumn="0"/>
+              <w:rPr>
+                <w:rFonts w:ascii="Times New Roman" w:hAnsi="Times New Roman" w:cs="Times New Roman"/>
+              </w:rPr>
+            </w:pPr>
+            <w:r>
+              <w:rPr>
+                <w:rFonts w:ascii="Times New Roman" w:hAnsi="Times New Roman" w:cs="Times New Roman"/>
+              </w:rPr>
+              <w:t>Passos</w:t>
+            </w:r>
+          </w:p>
+        </w:tc>
+        <w:tc>
+          <w:tcPr>
+            <w:tcW w:w="0" w:type="auto"/>
+            <w:hideMark/>
+          </w:tcPr>
+          <w:p>
+            <w:pPr>
+              <w:spacing w:line="276" w:lineRule="auto"/>
+              <w:cnfStyle w:val="100000000000" w:firstRow="1" w:lastRow="0" w:firstColumn="0" w:lastColumn="0" w:oddVBand="0" w:evenVBand="0" w:oddHBand="0" w:evenHBand="0" w:firstRowFirstColumn="0" w:firstRowLastColumn="0" w:lastRowFirstColumn="0" w:lastRowLastColumn="0"/>
+              <w:rPr>
+                <w:rFonts w:ascii="Times New Roman" w:hAnsi="Times New Roman" w:cs="Times New Roman"/>
+              </w:rPr>
+            </w:pPr>
+            <w:r>
+              <w:rPr>
+                <w:rFonts w:ascii="Times New Roman" w:hAnsi="Times New Roman" w:cs="Times New Roman"/>
+              </w:rPr>
+              <w:t>Nós expandidos</w:t>
+            </w:r>
+          </w:p>
+        </w:tc>
+        <w:tc>
+          <w:tcPr>
+            <w:tcW w:w="0" w:type="auto"/>
+            <w:hideMark/>
+          </w:tcPr>
+          <w:p>
+            <w:pPr>
+              <w:spacing w:line="276" w:lineRule="auto"/>
+              <w:cnfStyle w:val="100000000000" w:firstRow="1" w:lastRow="0" w:firstColumn="0" w:lastColumn="0" w:oddVBand="0" w:evenVBand="0" w:oddHBand="0" w:evenHBand="0" w:firstRowFirstColumn="0" w:firstRowLastColumn="0" w:lastRowFirstColumn="0" w:lastRowLastColumn="0"/>
+              <w:rPr>
+                <w:rFonts w:ascii="Times New Roman" w:hAnsi="Times New Roman" w:cs="Times New Roman"/>
+              </w:rPr>
+            </w:pPr>
+            <w:r>
+              <w:rPr>
+                <w:rFonts w:ascii="Times New Roman" w:hAnsi="Times New Roman" w:cs="Times New Roman"/>
+              </w:rPr>
+              <w:t>Tempo (ms)</w:t>
+            </w:r>
+          </w:p>
+        </w:tc>
+      </w:tr>
+      <w:tr>
+        <w:trPr>
+          <w:cnfStyle w:val="000000100000" w:firstRow="0" w:lastRow="0" w:firstColumn="0" w:lastColumn="0" w:oddVBand="0" w:evenVBand="0" w:oddHBand="1" w:evenHBand="0" w:firstRowFirstColumn="0" w:firstRowLastColumn="0" w:lastRowFirstColumn="0" w:lastRowLastColumn="0"/>
+        </w:trPr>
+        <w:tc>
+          <w:tcPr>
+            <w:cnfStyle w:val="001000000000" w:firstRow="0" w:lastRow="0" w:firstColumn="1" w:lastColumn="0" w:oddVBand="0" w:evenVBand="0" w:oddHBand="0" w:evenHBand="0" w:firstRowFirstColumn="0" w:firstRowLastColumn="0" w:lastRowFirstColumn="0" w:lastRowLastColumn="0"/>
+            <w:tcW w:w="0" w:type="auto"/>
+            <w:hideMark/>
+          </w:tcPr>
+          <w:p>
+            <w:pPr>
+              <w:spacing w:line="276" w:lineRule="auto"/>
+              <w:rPr>
+                <w:rFonts w:ascii="Times New Roman" w:hAnsi="Times New Roman" w:cs="Times New Roman"/>
+              </w:rPr>
+            </w:pPr>
+            <w:r>
+              <w:rPr>
+                <w:rFonts w:ascii="Times New Roman" w:hAnsi="Times New Roman" w:cs="Times New Roman"/>
+              </w:rPr>
+              <w:t>UCS</w:t>
+            </w:r>
+          </w:p>
+        </w:tc>
+        <w:tc>
+          <w:tcPr>
+            <w:tcW w:w="0" w:type="auto"/>
+            <w:hideMark/>
+          </w:tcPr>
+          <w:p>
+            <w:pPr>
+              <w:spacing w:line="276" w:lineRule="auto"/>
+              <w:cnfStyle w:val="000000100000" w:firstRow="0" w:lastRow="0" w:firstColumn="0" w:lastColumn="0" w:oddVBand="0" w:evenVBand="0" w:oddHBand="1" w:evenHBand="0" w:firstRowFirstColumn="0" w:firstRowLastColumn="0" w:lastRowFirstColumn="0" w:lastRowLastColumn="0"/>
+              <w:rPr>
+                <w:rFonts w:ascii="Times New Roman" w:hAnsi="Times New Roman" w:cs="Times New Roman"/>
+              </w:rPr>
+            </w:pPr>
+            <w:r>
+              <w:rPr>
+                <w:rFonts w:ascii="Times New Roman" w:hAnsi="Times New Roman" w:cs="Times New Roman"/>
+              </w:rPr>
+              <w:t>Não usa</w:t>
+            </w:r>
+          </w:p>
+        </w:tc>
+        <w:tc>
+          <w:tcPr>
+            <w:tcW w:w="0" w:type="auto"/>
+            <w:hideMark/>
+          </w:tcPr>
+          <w:p>
+            <w:pPr>
+              <w:spacing w:line="276" w:lineRule="auto"/>
+              <w:cnfStyle w:val="000000100000" w:firstRow="0" w:lastRow="0" w:firstColumn="0" w:lastColumn="0" w:oddVBand="0" w:evenVBand="0" w:oddHBand="1" w:evenHBand="0" w:firstRowFirstColumn="0" w:firstRowLastColumn="0" w:lastRowFirstColumn="0" w:lastRowLastColumn="0"/>
+              <w:rPr>
+                <w:rFonts w:ascii="Times New Roman" w:hAnsi="Times New Roman" w:cs="Times New Roman"/>
+              </w:rPr>
+            </w:pPr>
+            <w:r>
+              <w:rPr>
+                <w:rFonts w:ascii="Times New Roman" w:hAnsi="Times New Roman" w:cs="Times New Roman"/>
+              </w:rPr>
+              <w:t>28</w:t>
+            </w:r>
+          </w:p>
+        </w:tc>
+        <w:tc>
+          <w:tcPr>
+            <w:tcW w:w="0" w:type="auto"/>
+            <w:hideMark/>
+          </w:tcPr>
+          <w:p>
+            <w:pPr>
+              <w:spacing w:line="276" w:lineRule="auto"/>
+              <w:cnfStyle w:val="000000100000" w:firstRow="0" w:lastRow="0" w:firstColumn="0" w:lastColumn="0" w:oddVBand="0" w:evenVBand="0" w:oddHBand="1" w:evenHBand="0" w:firstRowFirstColumn="0" w:firstRowLastColumn="0" w:lastRowFirstColumn="0" w:lastRowLastColumn="0"/>
+              <w:rPr>
+                <w:rFonts w:ascii="Times New Roman" w:hAnsi="Times New Roman" w:cs="Times New Roman"/>
+              </w:rPr>
+            </w:pPr>
+            <w:r>
+              <w:rPr>
+                <w:rFonts w:ascii="Times New Roman" w:hAnsi="Times New Roman" w:cs="Times New Roman"/>
+              </w:rPr>
+              <w:t>28</w:t>
+            </w:r>
+          </w:p>
+        </w:tc>
+        <w:tc>
+          <w:tcPr>
+            <w:tcW w:w="0" w:type="auto"/>
+            <w:hideMark/>
+          </w:tcPr>
+          <w:p>
+            <w:pPr>
+              <w:spacing w:line="276" w:lineRule="auto"/>
+              <w:cnfStyle w:val="000000100000" w:firstRow="0" w:lastRow="0" w:firstColumn="0" w:lastColumn="0" w:oddVBand="0" w:evenVBand="0" w:oddHBand="1" w:evenHBand="0" w:firstRowFirstColumn="0" w:firstRowLastColumn="0" w:lastRowFirstColumn="0" w:lastRowLastColumn="0"/>
+              <w:rPr>
+                <w:rFonts w:ascii="Times New Roman" w:hAnsi="Times New Roman" w:cs="Times New Roman"/>
+              </w:rPr>
+            </w:pPr>
+            <w:r>
+              <w:rPr>
+                <w:rFonts w:ascii="Times New Roman" w:hAnsi="Times New Roman" w:cs="Times New Roman"/>
+              </w:rPr>
+              <w:t>43727</w:t>
+            </w:r>
+          </w:p>
+        </w:tc>
+        <w:tc>
+          <w:tcPr>
+            <w:tcW w:w="0" w:type="auto"/>
+            <w:hideMark/>
+          </w:tcPr>
+          <w:p>
+            <w:pPr>
+              <w:spacing w:line="276" w:lineRule="auto"/>
+              <w:cnfStyle w:val="000000100000" w:firstRow="0" w:lastRow="0" w:firstColumn="0" w:lastColumn="0" w:oddVBand="0" w:evenVBand="0" w:oddHBand="1" w:evenHBand="0" w:firstRowFirstColumn="0" w:firstRowLastColumn="0" w:lastRowFirstColumn="0" w:lastRowLastColumn="0"/>
+              <w:rPr>
+                <w:rFonts w:ascii="Times New Roman" w:hAnsi="Times New Roman" w:cs="Times New Roman"/>
+              </w:rPr>
+            </w:pPr>
+            <w:r>
+              <w:rPr>
+                <w:rFonts w:ascii="Times New Roman" w:hAnsi="Times New Roman" w:cs="Times New Roman"/>
+              </w:rPr>
+              <w:t>734.24</w:t>
+            </w:r>
+          </w:p>
+        </w:tc>
+      </w:tr>
+      <w:tr>
+        <w:tc>
+          <w:tcPr>
+            <w:cnfStyle w:val="001000000000" w:firstRow="0" w:lastRow="0" w:firstColumn="1" w:lastColumn="0" w:oddVBand="0" w:evenVBand="0" w:oddHBand="0" w:evenHBand="0" w:firstRowFirstColumn="0" w:firstRowLastColumn="0" w:lastRowFirstColumn="0" w:lastRowLastColumn="0"/>
+            <w:tcW w:w="0" w:type="auto"/>
+            <w:hideMark/>
+          </w:tcPr>
+          <w:p>
+            <w:pPr>
+              <w:spacing w:line="276" w:lineRule="auto"/>
+              <w:rPr>
+                <w:rFonts w:ascii="Times New Roman" w:hAnsi="Times New Roman" w:cs="Times New Roman"/>
+              </w:rPr>
+            </w:pPr>
+            <w:r>
+              <w:rPr>
+                <w:rFonts w:ascii="Times New Roman" w:hAnsi="Times New Roman" w:cs="Times New Roman"/>
+              </w:rPr>
+              <w:t>Gulosa</w:t>
+            </w:r>
+          </w:p>
+        </w:tc>
+        <w:tc>
+          <w:tcPr>
+            <w:tcW w:w="0" w:type="auto"/>
+            <w:hideMark/>
+          </w:tcPr>
+          <w:p>
+            <w:pPr>
+              <w:spacing w:line="276" w:lineRule="auto"/>
+              <w:cnfStyle w:val="000000000000" w:firstRow="0" w:lastRow="0" w:firstColumn="0" w:lastColumn="0" w:oddVBand="0" w:evenVBand="0" w:oddHBand="0" w:evenHBand="0" w:firstRowFirstColumn="0" w:firstRowLastColumn="0" w:lastRowFirstColumn="0" w:lastRowLastColumn="0"/>
+              <w:rPr>
+                <w:rFonts w:ascii="Times New Roman" w:hAnsi="Times New Roman" w:cs="Times New Roman"/>
+              </w:rPr>
+            </w:pPr>
+            <w:r>
+              <w:rPr>
+                <w:rFonts w:ascii="Times New Roman" w:hAnsi="Times New Roman" w:cs="Times New Roman"/>
+              </w:rPr>
+              <w:t>Manhattan</w:t>
+            </w:r>
+          </w:p>
+        </w:tc>
+        <w:tc>
+          <w:tcPr>
+            <w:tcW w:w="0" w:type="auto"/>
+            <w:hideMark/>
+          </w:tcPr>
+          <w:p>
+            <w:pPr>
+              <w:spacing w:line="276" w:lineRule="auto"/>
+              <w:cnfStyle w:val="000000000000" w:firstRow="0" w:lastRow="0" w:firstColumn="0" w:lastColumn="0" w:oddVBand="0" w:evenVBand="0" w:oddHBand="0" w:evenHBand="0" w:firstRowFirstColumn="0" w:firstRowLastColumn="0" w:lastRowFirstColumn="0" w:lastRowLastColumn="0"/>
+              <w:rPr>
+                <w:rFonts w:ascii="Times New Roman" w:hAnsi="Times New Roman" w:cs="Times New Roman"/>
+              </w:rPr>
+            </w:pPr>
+            <w:r>
+              <w:rPr>
+                <w:rFonts w:ascii="Times New Roman" w:hAnsi="Times New Roman" w:cs="Times New Roman"/>
+              </w:rPr>
+              <w:t>29</w:t>
+            </w:r>
+          </w:p>
+        </w:tc>
+        <w:tc>
+          <w:tcPr>
+            <w:tcW w:w="0" w:type="auto"/>
+            <w:hideMark/>
+          </w:tcPr>
+          <w:p>
+            <w:pPr>
+              <w:spacing w:line="276" w:lineRule="auto"/>
+              <w:cnfStyle w:val="000000000000" w:firstRow="0" w:lastRow="0" w:firstColumn="0" w:lastColumn="0" w:oddVBand="0" w:evenVBand="0" w:oddHBand="0" w:evenHBand="0" w:firstRowFirstColumn="0" w:firstRowLastColumn="0" w:lastRowFirstColumn="0" w:lastRowLastColumn="0"/>
+              <w:rPr>
+                <w:rFonts w:ascii="Times New Roman" w:hAnsi="Times New Roman" w:cs="Times New Roman"/>
+              </w:rPr>
+            </w:pPr>
+            <w:r>
+              <w:rPr>
+                <w:rFonts w:ascii="Times New Roman" w:hAnsi="Times New Roman" w:cs="Times New Roman"/>
+              </w:rPr>
+              <w:t>29</w:t>
+            </w:r>
+          </w:p>
+        </w:tc>
+        <w:tc>
+          <w:tcPr>
+            <w:tcW w:w="0" w:type="auto"/>
+            <w:hideMark/>
+          </w:tcPr>
+          <w:p>
+            <w:pPr>
+              <w:spacing w:line="276" w:lineRule="auto"/>
+              <w:cnfStyle w:val="000000000000" w:firstRow="0" w:lastRow="0" w:firstColumn="0" w:lastColumn="0" w:oddVBand="0" w:evenVBand="0" w:oddHBand="0" w:evenHBand="0" w:firstRowFirstColumn="0" w:firstRowLastColumn="0" w:lastRowFirstColumn="0" w:lastRowLastColumn="0"/>
+              <w:rPr>
+                <w:rFonts w:ascii="Times New Roman" w:hAnsi="Times New Roman" w:cs="Times New Roman"/>
+              </w:rPr>
+            </w:pPr>
+            <w:r>
+              <w:rPr>
+                <w:rFonts w:ascii="Times New Roman" w:hAnsi="Times New Roman" w:cs="Times New Roman"/>
+              </w:rPr>
+              <w:t>88</w:t>
+            </w:r>
+          </w:p>
+        </w:tc>
+        <w:tc>
+          <w:tcPr>
+            <w:tcW w:w="0" w:type="auto"/>
+            <w:hideMark/>
+          </w:tcPr>
+          <w:p>
+            <w:pPr>
+              <w:spacing w:line="276" w:lineRule="auto"/>
+              <w:cnfStyle w:val="000000000000" w:firstRow="0" w:lastRow="0" w:firstColumn="0" w:lastColumn="0" w:oddVBand="0" w:evenVBand="0" w:oddHBand="0" w:evenHBand="0" w:firstRowFirstColumn="0" w:firstRowLastColumn="0" w:lastRowFirstColumn="0" w:lastRowLastColumn="0"/>
+              <w:rPr>
+                <w:rFonts w:ascii="Times New Roman" w:hAnsi="Times New Roman" w:cs="Times New Roman"/>
+              </w:rPr>
+            </w:pPr>
+            <w:r>
+              <w:rPr>
+                <w:rFonts w:ascii="Times New Roman" w:hAnsi="Times New Roman" w:cs="Times New Roman"/>
+              </w:rPr>
+              <w:t>2.53</w:t>
+            </w:r>
+          </w:p>
+        </w:tc>
+      </w:tr>
+      <w:tr>
+        <w:trPr>
+          <w:cnfStyle w:val="000000100000" w:firstRow="0" w:lastRow="0" w:firstColumn="0" w:lastColumn="0" w:oddVBand="0" w:evenVBand="0" w:oddHBand="1" w:evenHBand="0" w:firstRowFirstColumn="0" w:firstRowLastColumn="0" w:lastRowFirstColumn="0" w:lastRowLastColumn="0"/>
+        </w:trPr>
+        <w:tc>
+          <w:tcPr>
+            <w:cnfStyle w:val="001000000000" w:firstRow="0" w:lastRow="0" w:firstColumn="1" w:lastColumn="0" w:oddVBand="0" w:evenVBand="0" w:oddHBand="0" w:evenHBand="0" w:firstRowFirstColumn="0" w:firstRowLastColumn="0" w:lastRowFirstColumn="0" w:lastRowLastColumn="0"/>
+            <w:tcW w:w="0" w:type="auto"/>
+            <w:hideMark/>
+          </w:tcPr>
+          <w:p>
+            <w:pPr>
+              <w:spacing w:line="276" w:lineRule="auto"/>
+              <w:rPr>
+                <w:rFonts w:ascii="Times New Roman" w:hAnsi="Times New Roman" w:cs="Times New Roman"/>
+              </w:rPr>
+            </w:pPr>
+            <w:r>
+              <w:rPr>
+                <w:rFonts w:ascii="Times New Roman" w:hAnsi="Times New Roman" w:cs="Times New Roman"/>
+              </w:rPr>
+              <w:t>A*</w:t>
+            </w:r>
+          </w:p>
+        </w:tc>
+        <w:tc>
+          <w:tcPr>
+            <w:tcW w:w="0" w:type="auto"/>
+            <w:hideMark/>
+          </w:tcPr>
+          <w:p>
+            <w:pPr>
+              <w:spacing w:line="276" w:lineRule="auto"/>
+              <w:cnfStyle w:val="000000100000" w:firstRow="0" w:lastRow="0" w:firstColumn="0" w:lastColumn="0" w:oddVBand="0" w:evenVBand="0" w:oddHBand="1" w:evenHBand="0" w:firstRowFirstColumn="0" w:firstRowLastColumn="0" w:lastRowFirstColumn="0" w:lastRowLastColumn="0"/>
+              <w:rPr>
+                <w:rFonts w:ascii="Times New Roman" w:hAnsi="Times New Roman" w:cs="Times New Roman"/>
+              </w:rPr>
+            </w:pPr>
+            <w:r>
+              <w:rPr>
+                <w:rFonts w:ascii="Times New Roman" w:hAnsi="Times New Roman" w:cs="Times New Roman"/>
+              </w:rPr>
+              <w:t>Manhattan</w:t>
+            </w:r>
+          </w:p>
+        </w:tc>
+        <w:tc>
+          <w:tcPr>
+            <w:tcW w:w="0" w:type="auto"/>
+            <w:hideMark/>
+          </w:tcPr>
+          <w:p>
+            <w:pPr>
+              <w:spacing w:line="276" w:lineRule="auto"/>
+              <w:cnfStyle w:val="000000100000" w:firstRow="0" w:lastRow="0" w:firstColumn="0" w:lastColumn="0" w:oddVBand="0" w:evenVBand="0" w:oddHBand="1" w:evenHBand="0" w:firstRowFirstColumn="0" w:firstRowLastColumn="0" w:lastRowFirstColumn="0" w:lastRowLastColumn="0"/>
+              <w:rPr>
+                <w:rFonts w:ascii="Times New Roman" w:hAnsi="Times New Roman" w:cs="Times New Roman"/>
+              </w:rPr>
+            </w:pPr>
+            <w:r>
+              <w:rPr>
+                <w:rFonts w:ascii="Times New Roman" w:hAnsi="Times New Roman" w:cs="Times New Roman"/>
+              </w:rPr>
+              <w:t>28</w:t>
+            </w:r>
+          </w:p>
+        </w:tc>
+        <w:tc>
+          <w:tcPr>
+            <w:tcW w:w="0" w:type="auto"/>
+            <w:hideMark/>
+          </w:tcPr>
+          <w:p>
+            <w:pPr>
+              <w:spacing w:line="276" w:lineRule="auto"/>
+              <w:cnfStyle w:val="000000100000" w:firstRow="0" w:lastRow="0" w:firstColumn="0" w:lastColumn="0" w:oddVBand="0" w:evenVBand="0" w:oddHBand="1" w:evenHBand="0" w:firstRowFirstColumn="0" w:firstRowLastColumn="0" w:lastRowFirstColumn="0" w:lastRowLastColumn="0"/>
+              <w:rPr>
+                <w:rFonts w:ascii="Times New Roman" w:hAnsi="Times New Roman" w:cs="Times New Roman"/>
+              </w:rPr>
+            </w:pPr>
+            <w:r>
+              <w:rPr>
+                <w:rFonts w:ascii="Times New Roman" w:hAnsi="Times New Roman" w:cs="Times New Roman"/>
+              </w:rPr>
+              <w:t>28</w:t>
+            </w:r>
+          </w:p>
+        </w:tc>
+        <w:tc>
+          <w:tcPr>
+            <w:tcW w:w="0" w:type="auto"/>
+            <w:hideMark/>
+          </w:tcPr>
+          <w:p>
+            <w:pPr>
+              <w:spacing w:line="276" w:lineRule="auto"/>
+              <w:cnfStyle w:val="000000100000" w:firstRow="0" w:lastRow="0" w:firstColumn="0" w:lastColumn="0" w:oddVBand="0" w:evenVBand="0" w:oddHBand="1" w:evenHBand="0" w:firstRowFirstColumn="0" w:firstRowLastColumn="0" w:lastRowFirstColumn="0" w:lastRowLastColumn="0"/>
+              <w:rPr>
+                <w:rFonts w:ascii="Times New Roman" w:hAnsi="Times New Roman" w:cs="Times New Roman"/>
+              </w:rPr>
+            </w:pPr>
+            <w:r>
+              <w:rPr>
+                <w:rFonts w:ascii="Times New Roman" w:hAnsi="Times New Roman" w:cs="Times New Roman"/>
+              </w:rPr>
+              <w:t>17626</w:t>
+            </w:r>
+          </w:p>
+        </w:tc>
+        <w:tc>
+          <w:tcPr>
+            <w:tcW w:w="0" w:type="auto"/>
+            <w:hideMark/>
+          </w:tcPr>
+          <w:p>
+            <w:pPr>
+              <w:spacing w:line="276" w:lineRule="auto"/>
+              <w:cnfStyle w:val="000000100000" w:firstRow="0" w:lastRow="0" w:firstColumn="0" w:lastColumn="0" w:oddVBand="0" w:evenVBand="0" w:oddHBand="1" w:evenHBand="0" w:firstRowFirstColumn="0" w:firstRowLastColumn="0" w:lastRowFirstColumn="0" w:lastRowLastColumn="0"/>
+              <w:rPr>
+                <w:rFonts w:ascii="Times New Roman" w:hAnsi="Times New Roman" w:cs="Times New Roman"/>
+              </w:rPr>
+            </w:pPr>
+            <w:r>
+              <w:rPr>
+                <w:rFonts w:ascii="Times New Roman" w:hAnsi="Times New Roman" w:cs="Times New Roman"/>
+              </w:rPr>
+              <w:t>352.49</w:t>
+            </w:r>
+          </w:p>
+        </w:tc>
+      </w:tr>
+    </w:tbl>
+    <w:p/>
+    <w:p>
+      <w:pPr>
+        <w:spacing w:line="360" w:lineRule="auto"/>
+        <w:ind w:firstLine="709"/>
         <w:jc w:val="both"/>
         <w:rPr>
           <w:rFonts w:ascii="Times New Roman" w:hAnsi="Times New Roman" w:cs="Times New Roman"/>
-          <w:b/>
-          <w:bCs/>
-          <w:color w:val="EE0000"/>
           <w:sz w:val="24"/>
           <w:szCs w:val="24"/>
         </w:rPr>
@@ -2170,44 +3796,141 @@
       <w:r>
         <w:rPr>
           <w:rFonts w:ascii="Times New Roman" w:hAnsi="Times New Roman" w:cs="Times New Roman"/>
-          <w:b/>
-          <w:bCs/>
-          <w:color w:val="EE0000"/>
-          <w:sz w:val="24"/>
-          <w:szCs w:val="24"/>
-        </w:rPr>
-        <w:t xml:space="preserve">TABELA </w:t>
-      </w:r>
-      <w:proofErr w:type="gramStart"/>
+          <w:sz w:val="24"/>
+          <w:szCs w:val="24"/>
+        </w:rPr>
+        <w:t xml:space="preserve">A análise dos resultados evidencia claramente o comportamento distinto de cada algoritmo diante do aumento da complexidade dos mapas do </w:t>
+      </w:r>
       <w:r>
         <w:rPr>
           <w:rFonts w:ascii="Times New Roman" w:hAnsi="Times New Roman" w:cs="Times New Roman"/>
-          <w:b/>
-          <w:bCs/>
-          <w:color w:val="EE0000"/>
-          <w:sz w:val="24"/>
-          <w:szCs w:val="24"/>
-        </w:rPr>
-        <w:t>PRA</w:t>
-      </w:r>
-      <w:proofErr w:type="gramEnd"/>
+          <w:sz w:val="24"/>
+          <w:szCs w:val="24"/>
+        </w:rPr>
+        <w:t>labirinto</w:t>
+      </w:r>
       <w:r>
         <w:rPr>
           <w:rFonts w:ascii="Times New Roman" w:hAnsi="Times New Roman" w:cs="Times New Roman"/>
-          <w:b/>
-          <w:bCs/>
-          <w:color w:val="EE0000"/>
-          <w:sz w:val="24"/>
-          <w:szCs w:val="24"/>
-        </w:rPr>
-        <w:t xml:space="preserve"> COLOCAR AQUI + PARÁGRAFO EXPLICANDO</w:t>
-      </w:r>
+          <w:sz w:val="24"/>
+          <w:szCs w:val="24"/>
+        </w:rPr>
+        <w:t>. A Busca de Custo Uniforme (UCS), por operar como uma busca cega sem o auxílio de heurísticas, revelou-se extremamente exaustiva. Embora tenha garantido a otimalidade ao encontrar sempre o menor custo e número de passos, a UCS sofreu um crescimento exponencial na quantidade de nós expandidos, saltando de 158 nós no Mapa 1 para impressionantes 43.727 nós no Mapa 3, o que impactou diretamente o tempo de processamento.</w:t>
+      </w:r>
+    </w:p>
+    <w:p>
+      <w:pPr>
+        <w:spacing w:line="360" w:lineRule="auto"/>
+        <w:ind w:firstLine="709"/>
+        <w:jc w:val="both"/>
+        <w:rPr>
+          <w:rFonts w:ascii="Times New Roman" w:hAnsi="Times New Roman" w:cs="Times New Roman"/>
+          <w:sz w:val="24"/>
+          <w:szCs w:val="24"/>
+        </w:rPr>
+      </w:pPr>
+    </w:p>
+    <w:p>
+      <w:pPr>
+        <w:spacing w:line="360" w:lineRule="auto"/>
+        <w:ind w:firstLine="709"/>
+        <w:jc w:val="both"/>
+        <w:rPr>
+          <w:rFonts w:ascii="Times New Roman" w:hAnsi="Times New Roman" w:cs="Times New Roman"/>
+          <w:sz w:val="24"/>
+          <w:szCs w:val="24"/>
+        </w:rPr>
+      </w:pPr>
+      <w:r>
+        <w:rPr>
+          <w:rFonts w:ascii="Times New Roman" w:hAnsi="Times New Roman" w:cs="Times New Roman"/>
+          <w:sz w:val="24"/>
+          <w:szCs w:val="24"/>
+        </w:rPr>
+        <w:lastRenderedPageBreak/>
+        <w:t>Em contrapartida, a Busca Gulosa destacou-se pela altíssima velocidade e economia drástica de recursos computacionais, guiando-se estritamente pela heurística de distância de Manhattan. No entanto, essa abordagem evidenciou sua principal limitação teórica</w:t>
+      </w:r>
+      <w:r>
+        <w:rPr>
+          <w:rFonts w:ascii="Times New Roman" w:hAnsi="Times New Roman" w:cs="Times New Roman"/>
+          <w:sz w:val="24"/>
+          <w:szCs w:val="24"/>
+        </w:rPr>
+        <w:t>, ou seja,</w:t>
+      </w:r>
+      <w:r>
+        <w:rPr>
+          <w:rFonts w:ascii="Times New Roman" w:hAnsi="Times New Roman" w:cs="Times New Roman"/>
+          <w:sz w:val="24"/>
+          <w:szCs w:val="24"/>
+        </w:rPr>
+        <w:t xml:space="preserve"> a perda de otimalidade. Nos Mapas 2 e 3, a Gulosa priorizou caminhos diretos que resultaram em soluções subótimas, entregando custos e passos superiores aos obtidos pela UCS e pelo A* (como no Mapa 2, onde gerou custo 25 frente ao ótimo de 17).</w:t>
+      </w:r>
+    </w:p>
+    <w:p>
+      <w:pPr>
+        <w:spacing w:line="360" w:lineRule="auto"/>
+        <w:ind w:firstLine="709"/>
+        <w:jc w:val="both"/>
+        <w:rPr>
+          <w:rFonts w:ascii="Times New Roman" w:hAnsi="Times New Roman" w:cs="Times New Roman"/>
+          <w:sz w:val="24"/>
+          <w:szCs w:val="24"/>
+        </w:rPr>
+      </w:pPr>
+    </w:p>
+    <w:p>
+      <w:pPr>
+        <w:spacing w:line="360" w:lineRule="auto"/>
+        <w:ind w:firstLine="709"/>
+        <w:jc w:val="both"/>
+        <w:rPr>
+          <w:rFonts w:ascii="Times New Roman" w:hAnsi="Times New Roman" w:cs="Times New Roman"/>
+          <w:sz w:val="24"/>
+          <w:szCs w:val="24"/>
+        </w:rPr>
+      </w:pPr>
+      <w:r>
+        <w:rPr>
+          <w:rFonts w:ascii="Times New Roman" w:hAnsi="Times New Roman" w:cs="Times New Roman"/>
+          <w:sz w:val="24"/>
+          <w:szCs w:val="24"/>
+        </w:rPr>
+        <w:t>Por fim, o algoritmo A</w:t>
+      </w:r>
+      <w:r>
+        <w:rPr>
+          <w:rFonts w:ascii="Times New Roman" w:hAnsi="Times New Roman" w:cs="Times New Roman"/>
+          <w:sz w:val="24"/>
+          <w:szCs w:val="24"/>
+        </w:rPr>
+        <w:t>*</w:t>
+      </w:r>
+      <w:r>
+        <w:rPr>
+          <w:rFonts w:ascii="Times New Roman" w:hAnsi="Times New Roman" w:cs="Times New Roman"/>
+          <w:sz w:val="24"/>
+          <w:szCs w:val="24"/>
+        </w:rPr>
+        <w:t xml:space="preserve"> consolidou-se como a solução mais equilibrada e eficiente do estudo. Combinando o custo acumulado com a estimativa heurística (g(n) + h(n)), o A* garantiu a mesma otimalidade e os menores custos da UCS, mas com uma redução expressiva de mais de 50% nos nós expandidos e no tempo de execução no cenário mais complexo. Esse contraste comprova empiricamente que o uso de uma heurística admissível direciona a busca com precisão, unindo a garantia de caminhos ótimos à eficiência computacional.</w:t>
+      </w:r>
+    </w:p>
+    <w:p>
+      <w:pPr>
+        <w:spacing w:line="360" w:lineRule="auto"/>
+        <w:ind w:firstLine="709"/>
+        <w:jc w:val="both"/>
+        <w:rPr>
+          <w:rFonts w:ascii="Times New Roman" w:hAnsi="Times New Roman" w:cs="Times New Roman"/>
+          <w:sz w:val="24"/>
+          <w:szCs w:val="24"/>
+        </w:rPr>
+      </w:pPr>
     </w:p>
     <w:p>
       <w:pPr>
         <w:pStyle w:val="Ttulo1"/>
       </w:pPr>
-      <w:bookmarkStart w:id="4" w:name="_Toc240117865"/>
       <w:r>
         <w:t>DISCUSSÃO</w:t>
       </w:r>
@@ -2233,22 +3956,13 @@
     <w:p/>
     <w:p/>
     <w:p/>
-    <w:p/>
-    <w:p/>
-    <w:p/>
-    <w:p/>
-    <w:p/>
-    <w:p/>
-    <w:p/>
-    <w:p/>
-    <w:p/>
-    <w:p/>
-    <w:p/>
-    <w:p/>
-    <w:p/>
-    <w:p/>
-    <w:p/>
-    <w:p/>
+    <w:p>
+      <w:pPr>
+        <w:tabs>
+          <w:tab w:val="left" w:pos="1521"/>
+        </w:tabs>
+      </w:pPr>
+    </w:p>
     <w:p/>
     <w:p>
       <w:pPr>
@@ -2256,7 +3970,14 @@
       </w:pPr>
       <w:bookmarkStart w:id="5" w:name="_Toc240117866"/>
       <w:r>
-        <w:t>CONCLUSÃO</w:t>
+        <w:lastRenderedPageBreak/>
+        <w:t>CON</w:t>
+      </w:r>
+      <w:r>
+        <w:t>C</w:t>
+      </w:r>
+      <w:r>
+        <w:t>LUSÃO</w:t>
       </w:r>
       <w:bookmarkEnd w:id="5"/>
     </w:p>
@@ -2304,33 +4025,438 @@
     <w:p/>
     <w:p/>
     <w:p/>
-    <w:p/>
-    <w:p/>
-    <w:p/>
-    <w:p/>
-    <w:p/>
-    <w:p/>
-    <w:p/>
-    <w:p/>
-    <w:p/>
-    <w:p/>
-    <w:p/>
-    <w:p/>
-    <w:p/>
-    <w:p/>
-    <w:p/>
-    <w:p/>
-    <w:p/>
     <w:p>
       <w:pPr>
         <w:pStyle w:val="Ttulo1"/>
       </w:pPr>
       <w:bookmarkStart w:id="6" w:name="_Toc240117867"/>
       <w:r>
+        <w:lastRenderedPageBreak/>
         <w:t>REFERÊNCIAS</w:t>
       </w:r>
       <w:bookmarkEnd w:id="6"/>
     </w:p>
+    <w:p>
+      <w:pPr>
+        <w:rPr>
+          <w:color w:val="1F1F1F"/>
+        </w:rPr>
+      </w:pPr>
+      <w:r>
+        <w:rPr>
+          <w:color w:val="1F1F1F"/>
+        </w:rPr>
+        <w:t xml:space="preserve">RED BLOB GAMES. </w:t>
+      </w:r>
+      <w:r>
+        <w:rPr>
+          <w:b/>
+          <w:bCs/>
+          <w:color w:val="1F1F1F"/>
+          <w:bdr w:val="none" w:sz="0" w:space="0" w:color="auto" w:frame="1"/>
+        </w:rPr>
+        <w:t>Introduction to A*</w:t>
+      </w:r>
+      <w:r>
+        <w:rPr>
+          <w:color w:val="1F1F1F"/>
+        </w:rPr>
+        <w:t xml:space="preserve">. Disponível em: </w:t>
+      </w:r>
+      <w:hyperlink r:id="rId9" w:tgtFrame="_blank" w:history="1">
+        <w:r>
+          <w:rPr>
+            <w:rStyle w:val="Hyperlink"/>
+            <w:color w:val="000000"/>
+            <w:bdr w:val="none" w:sz="0" w:space="0" w:color="auto" w:frame="1"/>
+          </w:rPr>
+          <w:t>https://www.redblobgames.com/pathfinding/a-star/introduction.html</w:t>
+        </w:r>
+      </w:hyperlink>
+      <w:r>
+        <w:rPr>
+          <w:color w:val="1F1F1F"/>
+        </w:rPr>
+        <w:t>. Acesso em: 1</w:t>
+      </w:r>
+      <w:r>
+        <w:rPr>
+          <w:color w:val="1F1F1F"/>
+        </w:rPr>
+        <w:t>2</w:t>
+      </w:r>
+      <w:r>
+        <w:rPr>
+          <w:color w:val="1F1F1F"/>
+        </w:rPr>
+        <w:t xml:space="preserve"> set. 2026.</w:t>
+      </w:r>
+    </w:p>
+    <w:p>
+      <w:pPr>
+        <w:rPr>
+          <w:color w:val="1F1F1F"/>
+        </w:rPr>
+      </w:pPr>
+    </w:p>
+    <w:p>
+      <w:pPr>
+        <w:rPr>
+          <w:color w:val="1F1F1F"/>
+        </w:rPr>
+      </w:pPr>
+      <w:r>
+        <w:rPr>
+          <w:color w:val="1F1F1F"/>
+        </w:rPr>
+        <w:t xml:space="preserve">JSOKO. </w:t>
+      </w:r>
+      <w:r>
+        <w:rPr>
+          <w:b/>
+          <w:bCs/>
+          <w:color w:val="1F1F1F"/>
+          <w:bdr w:val="none" w:sz="0" w:space="0" w:color="auto" w:frame="1"/>
+        </w:rPr>
+        <w:t>Sokoban Deadlocks</w:t>
+      </w:r>
+      <w:r>
+        <w:rPr>
+          <w:color w:val="1F1F1F"/>
+        </w:rPr>
+        <w:t xml:space="preserve">. Disponível em: </w:t>
+      </w:r>
+      <w:hyperlink r:id="rId10" w:tgtFrame="_blank" w:history="1">
+        <w:r>
+          <w:rPr>
+            <w:rStyle w:val="Hyperlink"/>
+            <w:color w:val="00B0F0"/>
+            <w:bdr w:val="none" w:sz="0" w:space="0" w:color="auto" w:frame="1"/>
+          </w:rPr>
+          <w:t>https://jsokoapplet</w:t>
+        </w:r>
+        <w:r>
+          <w:rPr>
+            <w:rStyle w:val="Hyperlink"/>
+            <w:color w:val="00B0F0"/>
+            <w:bdr w:val="none" w:sz="0" w:space="0" w:color="auto" w:frame="1"/>
+          </w:rPr>
+          <w:t>.</w:t>
+        </w:r>
+        <w:r>
+          <w:rPr>
+            <w:rStyle w:val="Hyperlink"/>
+            <w:color w:val="00B0F0"/>
+            <w:bdr w:val="none" w:sz="0" w:space="0" w:color="auto" w:frame="1"/>
+          </w:rPr>
+          <w:t>sourceforge.io/sokoban/deadlocks.html</w:t>
+        </w:r>
+      </w:hyperlink>
+      <w:r>
+        <w:rPr>
+          <w:color w:val="1F1F1F"/>
+        </w:rPr>
+        <w:t>. Acesso em: 1</w:t>
+      </w:r>
+      <w:r>
+        <w:rPr>
+          <w:color w:val="1F1F1F"/>
+        </w:rPr>
+        <w:t>2</w:t>
+      </w:r>
+      <w:r>
+        <w:rPr>
+          <w:color w:val="1F1F1F"/>
+        </w:rPr>
+        <w:t xml:space="preserve"> set. 2026.</w:t>
+      </w:r>
+    </w:p>
+    <w:p>
+      <w:pPr>
+        <w:rPr>
+          <w:color w:val="1F1F1F"/>
+        </w:rPr>
+      </w:pPr>
+    </w:p>
+    <w:p>
+      <w:pPr>
+        <w:rPr>
+          <w:color w:val="1F1F1F"/>
+        </w:rPr>
+      </w:pPr>
+      <w:r>
+        <w:rPr>
+          <w:color w:val="1F1F1F"/>
+        </w:rPr>
+        <w:t xml:space="preserve">MUCELINI, Marcos Augusto Campagnaro. </w:t>
+      </w:r>
+      <w:r>
+        <w:rPr>
+          <w:b/>
+          <w:bCs/>
+          <w:color w:val="1F1F1F"/>
+          <w:bdr w:val="none" w:sz="0" w:space="0" w:color="auto" w:frame="1"/>
+        </w:rPr>
+        <w:t xml:space="preserve">Agentes </w:t>
+      </w:r>
+      <w:r>
+        <w:rPr>
+          <w:b/>
+          <w:bCs/>
+          <w:color w:val="1F1F1F"/>
+          <w:bdr w:val="none" w:sz="0" w:space="0" w:color="auto" w:frame="1"/>
+        </w:rPr>
+        <w:t>I</w:t>
+      </w:r>
+      <w:r>
+        <w:rPr>
+          <w:b/>
+          <w:bCs/>
+          <w:color w:val="1F1F1F"/>
+          <w:bdr w:val="none" w:sz="0" w:space="0" w:color="auto" w:frame="1"/>
+        </w:rPr>
+        <w:t xml:space="preserve">nteligentes e </w:t>
+      </w:r>
+      <w:r>
+        <w:rPr>
+          <w:b/>
+          <w:bCs/>
+          <w:color w:val="1F1F1F"/>
+          <w:bdr w:val="none" w:sz="0" w:space="0" w:color="auto" w:frame="1"/>
+        </w:rPr>
+        <w:t>R</w:t>
+      </w:r>
+      <w:r>
+        <w:rPr>
+          <w:b/>
+          <w:bCs/>
+          <w:color w:val="1F1F1F"/>
+          <w:bdr w:val="none" w:sz="0" w:space="0" w:color="auto" w:frame="1"/>
+        </w:rPr>
+        <w:t xml:space="preserve">esolução de </w:t>
+      </w:r>
+      <w:r>
+        <w:rPr>
+          <w:b/>
+          <w:bCs/>
+          <w:color w:val="1F1F1F"/>
+          <w:bdr w:val="none" w:sz="0" w:space="0" w:color="auto" w:frame="1"/>
+        </w:rPr>
+        <w:t>P</w:t>
+      </w:r>
+      <w:r>
+        <w:rPr>
+          <w:b/>
+          <w:bCs/>
+          <w:color w:val="1F1F1F"/>
+          <w:bdr w:val="none" w:sz="0" w:space="0" w:color="auto" w:frame="1"/>
+        </w:rPr>
+        <w:t xml:space="preserve">roblemas de </w:t>
+      </w:r>
+      <w:r>
+        <w:rPr>
+          <w:b/>
+          <w:bCs/>
+          <w:color w:val="1F1F1F"/>
+          <w:bdr w:val="none" w:sz="0" w:space="0" w:color="auto" w:frame="1"/>
+        </w:rPr>
+        <w:t>B</w:t>
+      </w:r>
+      <w:r>
+        <w:rPr>
+          <w:b/>
+          <w:bCs/>
+          <w:color w:val="1F1F1F"/>
+          <w:bdr w:val="none" w:sz="0" w:space="0" w:color="auto" w:frame="1"/>
+        </w:rPr>
+        <w:t>usca</w:t>
+      </w:r>
+      <w:r>
+        <w:rPr>
+          <w:color w:val="1F1F1F"/>
+        </w:rPr>
+        <w:t>. Material didático (Slides de aula), 2026.</w:t>
+      </w:r>
+    </w:p>
+    <w:p>
+      <w:pPr>
+        <w:rPr>
+          <w:color w:val="1F1F1F"/>
+        </w:rPr>
+      </w:pPr>
+    </w:p>
+    <w:p>
+      <w:pPr>
+        <w:rPr>
+          <w:color w:val="1F1F1F"/>
+        </w:rPr>
+      </w:pPr>
+      <w:r>
+        <w:rPr>
+          <w:color w:val="1F1F1F"/>
+        </w:rPr>
+        <w:t xml:space="preserve">MUCELINI, Marcos Augusto Campagnaro. </w:t>
+      </w:r>
+      <w:r>
+        <w:rPr>
+          <w:b/>
+          <w:bCs/>
+          <w:color w:val="1F1F1F"/>
+          <w:bdr w:val="none" w:sz="0" w:space="0" w:color="auto" w:frame="1"/>
+        </w:rPr>
+        <w:t xml:space="preserve">Problema de </w:t>
+      </w:r>
+      <w:r>
+        <w:rPr>
+          <w:b/>
+          <w:bCs/>
+          <w:color w:val="1F1F1F"/>
+          <w:bdr w:val="none" w:sz="0" w:space="0" w:color="auto" w:frame="1"/>
+        </w:rPr>
+        <w:t>B</w:t>
+      </w:r>
+      <w:r>
+        <w:rPr>
+          <w:b/>
+          <w:bCs/>
+          <w:color w:val="1F1F1F"/>
+          <w:bdr w:val="none" w:sz="0" w:space="0" w:color="auto" w:frame="1"/>
+        </w:rPr>
+        <w:t xml:space="preserve">usca e </w:t>
+      </w:r>
+      <w:r>
+        <w:rPr>
+          <w:b/>
+          <w:bCs/>
+          <w:color w:val="1F1F1F"/>
+          <w:bdr w:val="none" w:sz="0" w:space="0" w:color="auto" w:frame="1"/>
+        </w:rPr>
+        <w:t>B</w:t>
+      </w:r>
+      <w:r>
+        <w:rPr>
+          <w:b/>
+          <w:bCs/>
+          <w:color w:val="1F1F1F"/>
+          <w:bdr w:val="none" w:sz="0" w:space="0" w:color="auto" w:frame="1"/>
+        </w:rPr>
+        <w:t xml:space="preserve">usca </w:t>
+      </w:r>
+      <w:r>
+        <w:rPr>
+          <w:b/>
+          <w:bCs/>
+          <w:color w:val="1F1F1F"/>
+          <w:bdr w:val="none" w:sz="0" w:space="0" w:color="auto" w:frame="1"/>
+        </w:rPr>
+        <w:t>N</w:t>
+      </w:r>
+      <w:r>
+        <w:rPr>
+          <w:b/>
+          <w:bCs/>
+          <w:color w:val="1F1F1F"/>
+          <w:bdr w:val="none" w:sz="0" w:space="0" w:color="auto" w:frame="1"/>
+        </w:rPr>
+        <w:t xml:space="preserve">ão </w:t>
+      </w:r>
+      <w:r>
+        <w:rPr>
+          <w:b/>
+          <w:bCs/>
+          <w:color w:val="1F1F1F"/>
+          <w:bdr w:val="none" w:sz="0" w:space="0" w:color="auto" w:frame="1"/>
+        </w:rPr>
+        <w:t>I</w:t>
+      </w:r>
+      <w:r>
+        <w:rPr>
+          <w:b/>
+          <w:bCs/>
+          <w:color w:val="1F1F1F"/>
+          <w:bdr w:val="none" w:sz="0" w:space="0" w:color="auto" w:frame="1"/>
+        </w:rPr>
+        <w:t>nformada (</w:t>
+      </w:r>
+      <w:r>
+        <w:rPr>
+          <w:b/>
+          <w:bCs/>
+          <w:color w:val="1F1F1F"/>
+          <w:bdr w:val="none" w:sz="0" w:space="0" w:color="auto" w:frame="1"/>
+        </w:rPr>
+        <w:t>C</w:t>
+      </w:r>
+      <w:r>
+        <w:rPr>
+          <w:b/>
+          <w:bCs/>
+          <w:color w:val="1F1F1F"/>
+          <w:bdr w:val="none" w:sz="0" w:space="0" w:color="auto" w:frame="1"/>
+        </w:rPr>
+        <w:t>ega)</w:t>
+      </w:r>
+      <w:r>
+        <w:rPr>
+          <w:color w:val="1F1F1F"/>
+        </w:rPr>
+        <w:t>. Material didático (Slides de aula), 2026.</w:t>
+      </w:r>
+    </w:p>
+    <w:p>
+      <w:pPr>
+        <w:rPr>
+          <w:color w:val="1F1F1F"/>
+        </w:rPr>
+      </w:pPr>
+    </w:p>
+    <w:p>
+      <w:pPr>
+        <w:rPr>
+          <w:color w:val="1F1F1F"/>
+        </w:rPr>
+      </w:pPr>
+      <w:r>
+        <w:rPr>
+          <w:color w:val="1F1F1F"/>
+        </w:rPr>
+        <w:t xml:space="preserve">MUCELINI, Marcos Augusto Campagnaro. </w:t>
+      </w:r>
+      <w:r>
+        <w:rPr>
+          <w:b/>
+          <w:bCs/>
+          <w:color w:val="1F1F1F"/>
+          <w:bdr w:val="none" w:sz="0" w:space="0" w:color="auto" w:frame="1"/>
+        </w:rPr>
+        <w:t xml:space="preserve">Busca informada: Best first, </w:t>
+      </w:r>
+      <w:r>
+        <w:rPr>
+          <w:b/>
+          <w:bCs/>
+          <w:color w:val="1F1F1F"/>
+          <w:bdr w:val="none" w:sz="0" w:space="0" w:color="auto" w:frame="1"/>
+        </w:rPr>
+        <w:t>G</w:t>
+      </w:r>
+      <w:r>
+        <w:rPr>
+          <w:b/>
+          <w:bCs/>
+          <w:color w:val="1F1F1F"/>
+          <w:bdr w:val="none" w:sz="0" w:space="0" w:color="auto" w:frame="1"/>
+        </w:rPr>
+        <w:t>ulosa e A*</w:t>
+      </w:r>
+      <w:r>
+        <w:rPr>
+          <w:color w:val="1F1F1F"/>
+        </w:rPr>
+        <w:t>. Material didático (Slides de aula), 2026.</w:t>
+      </w:r>
+    </w:p>
+    <w:p/>
     <w:p>
       <w:pPr>
         <w:pStyle w:val="Ttulo1"/>
@@ -2342,8 +4468,8 @@
       </w:pPr>
     </w:p>
     <w:sectPr>
-      <w:headerReference w:type="default" r:id="rId9"/>
-      <w:footerReference w:type="default" r:id="rId10"/>
+      <w:headerReference w:type="default" r:id="rId11"/>
+      <w:footerReference w:type="default" r:id="rId12"/>
       <w:pgSz w:w="11909" w:h="16834"/>
       <w:pgMar w:top="1440" w:right="1440" w:bottom="1440" w:left="1440" w:header="720" w:footer="720" w:gutter="0"/>
       <w:pgNumType w:start="1"/>
@@ -3803,7 +5929,7 @@
   <w:style w:type="paragraph" w:default="1" w:styleId="Normal">
     <w:name w:val="Normal"/>
     <w:qFormat/>
-    <w:rsid w:val="008D7B41"/>
+    <w:rsid w:val="00B66C22"/>
   </w:style>
   <w:style w:type="paragraph" w:styleId="Ttulo1">
     <w:name w:val="heading 1"/>
@@ -4120,6 +6246,149 @@
     <w:pPr>
       <w:spacing w:after="100"/>
     </w:pPr>
+  </w:style>
+  <w:style w:type="table" w:styleId="Tabelacomgrade">
+    <w:name w:val="Table Grid"/>
+    <w:basedOn w:val="Tabelanormal"/>
+    <w:uiPriority w:val="39"/>
+    <w:rsid w:val="009812E7"/>
+    <w:pPr>
+      <w:spacing w:line="240" w:lineRule="auto"/>
+    </w:pPr>
+    <w:tblPr>
+      <w:tblBorders>
+        <w:top w:val="single" w:sz="4" w:space="0" w:color="auto"/>
+        <w:left w:val="single" w:sz="4" w:space="0" w:color="auto"/>
+        <w:bottom w:val="single" w:sz="4" w:space="0" w:color="auto"/>
+        <w:right w:val="single" w:sz="4" w:space="0" w:color="auto"/>
+        <w:insideH w:val="single" w:sz="4" w:space="0" w:color="auto"/>
+        <w:insideV w:val="single" w:sz="4" w:space="0" w:color="auto"/>
+      </w:tblBorders>
+    </w:tblPr>
+  </w:style>
+  <w:style w:type="table" w:styleId="TabeladeGradeClara">
+    <w:name w:val="Grid Table Light"/>
+    <w:basedOn w:val="Tabelanormal"/>
+    <w:uiPriority w:val="40"/>
+    <w:rsid w:val="003C58B3"/>
+    <w:pPr>
+      <w:spacing w:line="240" w:lineRule="auto"/>
+    </w:pPr>
+    <w:tblPr>
+      <w:tblBorders>
+        <w:top w:val="single" w:sz="4" w:space="0" w:color="BFBFBF" w:themeColor="background1" w:themeShade="BF"/>
+        <w:left w:val="single" w:sz="4" w:space="0" w:color="BFBFBF" w:themeColor="background1" w:themeShade="BF"/>
+        <w:bottom w:val="single" w:sz="4" w:space="0" w:color="BFBFBF" w:themeColor="background1" w:themeShade="BF"/>
+        <w:right w:val="single" w:sz="4" w:space="0" w:color="BFBFBF" w:themeColor="background1" w:themeShade="BF"/>
+        <w:insideH w:val="single" w:sz="4" w:space="0" w:color="BFBFBF" w:themeColor="background1" w:themeShade="BF"/>
+        <w:insideV w:val="single" w:sz="4" w:space="0" w:color="BFBFBF" w:themeColor="background1" w:themeShade="BF"/>
+      </w:tblBorders>
+    </w:tblPr>
+  </w:style>
+  <w:style w:type="table" w:styleId="SimplesTabela3">
+    <w:name w:val="Plain Table 3"/>
+    <w:basedOn w:val="Tabelanormal"/>
+    <w:uiPriority w:val="43"/>
+    <w:rsid w:val="00903FEA"/>
+    <w:pPr>
+      <w:spacing w:line="240" w:lineRule="auto"/>
+    </w:pPr>
+    <w:tblPr>
+      <w:tblStyleRowBandSize w:val="1"/>
+      <w:tblStyleColBandSize w:val="1"/>
+    </w:tblPr>
+    <w:tblStylePr w:type="firstRow">
+      <w:rPr>
+        <w:b/>
+        <w:bCs/>
+        <w:caps/>
+      </w:rPr>
+      <w:tblPr/>
+      <w:tcPr>
+        <w:tcBorders>
+          <w:bottom w:val="single" w:sz="4" w:space="0" w:color="7F7F7F" w:themeColor="text1" w:themeTint="80"/>
+        </w:tcBorders>
+      </w:tcPr>
+    </w:tblStylePr>
+    <w:tblStylePr w:type="lastRow">
+      <w:rPr>
+        <w:b/>
+        <w:bCs/>
+        <w:caps/>
+      </w:rPr>
+      <w:tblPr/>
+      <w:tcPr>
+        <w:tcBorders>
+          <w:top w:val="nil"/>
+        </w:tcBorders>
+      </w:tcPr>
+    </w:tblStylePr>
+    <w:tblStylePr w:type="firstCol">
+      <w:rPr>
+        <w:b/>
+        <w:bCs/>
+        <w:caps/>
+      </w:rPr>
+      <w:tblPr/>
+      <w:tcPr>
+        <w:tcBorders>
+          <w:right w:val="single" w:sz="4" w:space="0" w:color="7F7F7F" w:themeColor="text1" w:themeTint="80"/>
+        </w:tcBorders>
+      </w:tcPr>
+    </w:tblStylePr>
+    <w:tblStylePr w:type="lastCol">
+      <w:rPr>
+        <w:b/>
+        <w:bCs/>
+        <w:caps/>
+      </w:rPr>
+      <w:tblPr/>
+      <w:tcPr>
+        <w:tcBorders>
+          <w:left w:val="nil"/>
+        </w:tcBorders>
+      </w:tcPr>
+    </w:tblStylePr>
+    <w:tblStylePr w:type="band1Vert">
+      <w:tblPr/>
+      <w:tcPr>
+        <w:shd w:val="clear" w:color="auto" w:fill="F2F2F2" w:themeFill="background1" w:themeFillShade="F2"/>
+      </w:tcPr>
+    </w:tblStylePr>
+    <w:tblStylePr w:type="band1Horz">
+      <w:tblPr/>
+      <w:tcPr>
+        <w:shd w:val="clear" w:color="auto" w:fill="F2F2F2" w:themeFill="background1" w:themeFillShade="F2"/>
+      </w:tcPr>
+    </w:tblStylePr>
+    <w:tblStylePr w:type="neCell">
+      <w:tblPr/>
+      <w:tcPr>
+        <w:tcBorders>
+          <w:left w:val="nil"/>
+        </w:tcBorders>
+      </w:tcPr>
+    </w:tblStylePr>
+    <w:tblStylePr w:type="nwCell">
+      <w:tblPr/>
+      <w:tcPr>
+        <w:tcBorders>
+          <w:right w:val="nil"/>
+        </w:tcBorders>
+      </w:tcPr>
+    </w:tblStylePr>
+  </w:style>
+  <w:style w:type="character" w:styleId="HiperlinkVisitado">
+    <w:name w:val="FollowedHyperlink"/>
+    <w:basedOn w:val="Fontepargpadro"/>
+    <w:uiPriority w:val="99"/>
+    <w:semiHidden/>
+    <w:unhideWhenUsed/>
+    <w:rsid w:val="00482FF8"/>
+    <w:rPr>
+      <w:color w:val="800080" w:themeColor="followedHyperlink"/>
+      <w:u w:val="single"/>
+    </w:rPr>
   </w:style>
 </w:styles>
 </file>

</xml_diff>